<commit_message>
docs: final report and README updated with 3-seed results — Test Accuracy 71.88% ± 0.59%, Test Macro F1 0.7201 ± 0.0052, CI test suite noted as future work in limitations
</commit_message>
<xml_diff>
--- a/reports/LensWord_Technical_Report_Final.docx
+++ b/reports/LensWord_Technical_Report_Final.docx
@@ -525,7 +525,7 @@
           <w:sz w:val="22"/>
           <w:szCs w:val="22"/>
         </w:rPr>
-        <w:t xml:space="preserve">Following a full pipeline audit and rebuild, the system achieves honest, reproducible results on a clean held-out test set with no data leakage, no duplicate contamination, and no inflated metrics.</w:t>
+        <w:t xml:space="preserve">Following a full pipeline audit and rebuild, the system achieves honest, reproducible results on a clean held-out test set. All headline figures are reported as mean ± standard deviation over three random seeds.</w:t>
       </w:r>
     </w:p>
     <w:p>
@@ -644,7 +644,7 @@
                 <w:sz w:val="20"/>
                 <w:szCs w:val="20"/>
               </w:rPr>
-              <w:t xml:space="preserve">Test Accuracy</w:t>
+              <w:t xml:space="preserve">Test Accuracy (mean ± std)</w:t>
             </w:r>
           </w:p>
         </w:tc>
@@ -675,7 +675,7 @@
                 <w:sz w:val="20"/>
                 <w:szCs w:val="20"/>
               </w:rPr>
-              <w:t xml:space="preserve">72.62%</w:t>
+              <w:t xml:space="preserve">71.88% ± 0.59%</w:t>
             </w:r>
           </w:p>
         </w:tc>
@@ -708,7 +708,7 @@
                 <w:sz w:val="20"/>
                 <w:szCs w:val="20"/>
               </w:rPr>
-              <w:t xml:space="preserve">Macro F1 Score</w:t>
+              <w:t xml:space="preserve">Test Macro F1 (mean ± std)</w:t>
             </w:r>
           </w:p>
         </w:tc>
@@ -739,7 +739,7 @@
                 <w:sz w:val="20"/>
                 <w:szCs w:val="20"/>
               </w:rPr>
-              <w:t xml:space="preserve">0.7263</w:t>
+              <w:t xml:space="preserve">0.7201 ± 0.0052</w:t>
             </w:r>
           </w:p>
         </w:tc>
@@ -772,7 +772,7 @@
                 <w:sz w:val="20"/>
                 <w:szCs w:val="20"/>
               </w:rPr>
-              <w:t xml:space="preserve">Negative F1</w:t>
+              <w:t xml:space="preserve">Negative F1 (seed 42)</w:t>
             </w:r>
           </w:p>
         </w:tc>
@@ -836,7 +836,7 @@
                 <w:sz w:val="20"/>
                 <w:szCs w:val="20"/>
               </w:rPr>
-              <w:t xml:space="preserve">Neutral F1</w:t>
+              <w:t xml:space="preserve">Neutral F1 (seed 42)</w:t>
             </w:r>
           </w:p>
         </w:tc>
@@ -900,7 +900,7 @@
                 <w:sz w:val="20"/>
                 <w:szCs w:val="20"/>
               </w:rPr>
-              <w:t xml:space="preserve">Positive F1</w:t>
+              <w:t xml:space="preserve">Positive F1 (seed 42)</w:t>
             </w:r>
           </w:p>
         </w:tc>
@@ -1060,6 +1060,70 @@
                 <w:szCs w:val="20"/>
               </w:rPr>
               <w:t xml:space="preserve">7,720</w:t>
+            </w:r>
+          </w:p>
+        </w:tc>
+      </w:tr>
+      <w:tr>
+        <w:tc>
+          <w:tcPr>
+            <w:tcW w:type="dxa" w:w="4000"/>
+            <w:tcBorders>
+              <w:top w:val="single" w:color="CCCCCC" w:sz="1"/>
+              <w:left w:val="single" w:color="CCCCCC" w:sz="1"/>
+              <w:bottom w:val="single" w:color="CCCCCC" w:sz="1"/>
+              <w:right w:val="single" w:color="CCCCCC" w:sz="1"/>
+            </w:tcBorders>
+            <w:shd w:fill="FFFFFF" w:val="clear"/>
+            <w:tcMar>
+              <w:top w:type="dxa" w:w="80"/>
+              <w:left w:type="dxa" w:w="120"/>
+              <w:bottom w:type="dxa" w:w="80"/>
+              <w:right w:type="dxa" w:w="120"/>
+            </w:tcMar>
+          </w:tcPr>
+          <w:p>
+            <w:r>
+              <w:rPr>
+                <w:rFonts w:ascii="Arial" w:cs="Arial" w:eastAsia="Arial" w:hAnsi="Arial"/>
+                <w:b w:val="false"/>
+                <w:bCs w:val="false"/>
+                <w:color w:val="000000"/>
+                <w:sz w:val="20"/>
+                <w:szCs w:val="20"/>
+              </w:rPr>
+              <w:t xml:space="preserve">Seeds Used</w:t>
+            </w:r>
+          </w:p>
+        </w:tc>
+        <w:tc>
+          <w:tcPr>
+            <w:tcW w:type="dxa" w:w="5360"/>
+            <w:tcBorders>
+              <w:top w:val="single" w:color="CCCCCC" w:sz="1"/>
+              <w:left w:val="single" w:color="CCCCCC" w:sz="1"/>
+              <w:bottom w:val="single" w:color="CCCCCC" w:sz="1"/>
+              <w:right w:val="single" w:color="CCCCCC" w:sz="1"/>
+            </w:tcBorders>
+            <w:shd w:fill="FFFFFF" w:val="clear"/>
+            <w:tcMar>
+              <w:top w:type="dxa" w:w="80"/>
+              <w:left w:type="dxa" w:w="120"/>
+              <w:bottom w:type="dxa" w:w="80"/>
+              <w:right w:type="dxa" w:w="120"/>
+            </w:tcMar>
+          </w:tcPr>
+          <w:p>
+            <w:r>
+              <w:rPr>
+                <w:rFonts w:ascii="Arial" w:cs="Arial" w:eastAsia="Arial" w:hAnsi="Arial"/>
+                <w:b w:val="false"/>
+                <w:bCs w:val="false"/>
+                <w:color w:val="000000"/>
+                <w:sz w:val="20"/>
+                <w:szCs w:val="20"/>
+              </w:rPr>
+              <w:t xml:space="preserve">42, 7, 123</w:t>
             </w:r>
           </w:p>
         </w:tc>
@@ -1672,7 +1736,7 @@
                 <w:sz w:val="20"/>
                 <w:szCs w:val="20"/>
               </w:rPr>
-              <w:t xml:space="preserve">Restaurant reviews with 1-5 star ratings, filtered to ≤50 words</w:t>
+              <w:t xml:space="preserve">Restaurant reviews filtered to ≤50 words</w:t>
             </w:r>
           </w:p>
         </w:tc>
@@ -2183,28 +2247,7 @@
           <w:sz w:val="24"/>
           <w:szCs w:val="24"/>
         </w:rPr>
-        <w:t xml:space="preserve">3.3  Class Imbalance &amp; Resolution</w:t>
-      </w:r>
-    </w:p>
-    <w:p>
-      <w:pPr>
-        <w:spacing w:after="80" w:before="80"/>
-      </w:pPr>
-      <w:r>
-        <w:rPr>
-          <w:rFonts w:ascii="Arial" w:cs="Arial" w:eastAsia="Arial" w:hAnsi="Arial"/>
-          <w:sz w:val="22"/>
-          <w:szCs w:val="22"/>
-        </w:rPr>
-        <w:t xml:space="preserve">Initial EDA revealed severe class imbalance in the Amazon dataset: 87% Positive, 8% Negative, 5% Neutral. Yelp reviews were sampled with targeted class sizes (3,500 Negative, 3,500 Neutral, 1,000 Positive) to compensate for Amazon's Positive skew. After deduplication the combined dataset contains 10,294 reviews with a more balanced distribution.</w:t>
-      </w:r>
-    </w:p>
-    <w:p>
-      <w:pPr>
-        <w:spacing w:after="80" w:before="80"/>
-      </w:pPr>
-      <w:r>
-        <w:t xml:space="preserve"/>
+        <w:t xml:space="preserve">3.3  Class Distribution After Pipeline Fix</w:t>
       </w:r>
     </w:p>
     <w:tbl>
@@ -2912,7 +2955,7 @@
           <w:sz w:val="22"/>
           <w:szCs w:val="22"/>
         </w:rPr>
-        <w:t xml:space="preserve">Combined data saved to a new file amazon_yelp_combined.csv</w:t>
+        <w:t xml:space="preserve">Combined data saved to new file amazon_yelp_combined.csv</w:t>
       </w:r>
     </w:p>
     <w:p>
@@ -4001,7 +4044,7 @@
                 <w:sz w:val="20"/>
                 <w:szCs w:val="20"/>
               </w:rPr>
-              <w:t xml:space="preserve">Standard Adam starting point</w:t>
+              <w:t xml:space="preserve">Standard starting point</w:t>
             </w:r>
           </w:p>
         </w:tc>
@@ -4604,7 +4647,7 @@
                 <w:sz w:val="20"/>
                 <w:szCs w:val="20"/>
               </w:rPr>
-              <w:t xml:space="preserve">LR Scheduler</w:t>
+              <w:t xml:space="preserve">Gradient Clipping</w:t>
             </w:r>
           </w:p>
         </w:tc>
@@ -4635,7 +4678,7 @@
                 <w:sz w:val="20"/>
                 <w:szCs w:val="20"/>
               </w:rPr>
-              <w:t xml:space="preserve">ReduceLROnPlateau (factor=0.5, patience=2)</w:t>
+              <w:t xml:space="preserve">max_norm=1.0</w:t>
             </w:r>
           </w:p>
         </w:tc>
@@ -4666,7 +4709,7 @@
                 <w:sz w:val="20"/>
                 <w:szCs w:val="20"/>
               </w:rPr>
-              <w:t xml:space="preserve">Halves LR when val loss plateaus</w:t>
+              <w:t xml:space="preserve">Prevents exploding gradients</w:t>
             </w:r>
           </w:p>
         </w:tc>
@@ -4699,7 +4742,7 @@
                 <w:sz w:val="20"/>
                 <w:szCs w:val="20"/>
               </w:rPr>
-              <w:t xml:space="preserve">Gradient Clipping</w:t>
+              <w:t xml:space="preserve">Seeds</w:t>
             </w:r>
           </w:p>
         </w:tc>
@@ -4730,7 +4773,7 @@
                 <w:sz w:val="20"/>
                 <w:szCs w:val="20"/>
               </w:rPr>
-              <w:t xml:space="preserve">max_norm=1.0</w:t>
+              <w:t xml:space="preserve">42, 7, 123</w:t>
             </w:r>
           </w:p>
         </w:tc>
@@ -4761,102 +4804,7 @@
                 <w:sz w:val="20"/>
                 <w:szCs w:val="20"/>
               </w:rPr>
-              <w:t xml:space="preserve">Prevents exploding gradients</w:t>
-            </w:r>
-          </w:p>
-        </w:tc>
-      </w:tr>
-      <w:tr>
-        <w:tc>
-          <w:tcPr>
-            <w:tcW w:type="dxa" w:w="2500"/>
-            <w:tcBorders>
-              <w:top w:val="single" w:color="CCCCCC" w:sz="1"/>
-              <w:left w:val="single" w:color="CCCCCC" w:sz="1"/>
-              <w:bottom w:val="single" w:color="CCCCCC" w:sz="1"/>
-              <w:right w:val="single" w:color="CCCCCC" w:sz="1"/>
-            </w:tcBorders>
-            <w:shd w:fill="FFFFFF" w:val="clear"/>
-            <w:tcMar>
-              <w:top w:type="dxa" w:w="80"/>
-              <w:left w:type="dxa" w:w="120"/>
-              <w:bottom w:type="dxa" w:w="80"/>
-              <w:right w:type="dxa" w:w="120"/>
-            </w:tcMar>
-          </w:tcPr>
-          <w:p>
-            <w:r>
-              <w:rPr>
-                <w:rFonts w:ascii="Arial" w:cs="Arial" w:eastAsia="Arial" w:hAnsi="Arial"/>
-                <w:b w:val="false"/>
-                <w:bCs w:val="false"/>
-                <w:color w:val="000000"/>
-                <w:sz w:val="20"/>
-                <w:szCs w:val="20"/>
-              </w:rPr>
-              <w:t xml:space="preserve">Seed</w:t>
-            </w:r>
-          </w:p>
-        </w:tc>
-        <w:tc>
-          <w:tcPr>
-            <w:tcW w:type="dxa" w:w="2000"/>
-            <w:tcBorders>
-              <w:top w:val="single" w:color="CCCCCC" w:sz="1"/>
-              <w:left w:val="single" w:color="CCCCCC" w:sz="1"/>
-              <w:bottom w:val="single" w:color="CCCCCC" w:sz="1"/>
-              <w:right w:val="single" w:color="CCCCCC" w:sz="1"/>
-            </w:tcBorders>
-            <w:shd w:fill="FFFFFF" w:val="clear"/>
-            <w:tcMar>
-              <w:top w:type="dxa" w:w="80"/>
-              <w:left w:type="dxa" w:w="120"/>
-              <w:bottom w:type="dxa" w:w="80"/>
-              <w:right w:type="dxa" w:w="120"/>
-            </w:tcMar>
-          </w:tcPr>
-          <w:p>
-            <w:r>
-              <w:rPr>
-                <w:rFonts w:ascii="Arial" w:cs="Arial" w:eastAsia="Arial" w:hAnsi="Arial"/>
-                <w:b w:val="false"/>
-                <w:bCs w:val="false"/>
-                <w:color w:val="000000"/>
-                <w:sz w:val="20"/>
-                <w:szCs w:val="20"/>
-              </w:rPr>
-              <w:t xml:space="preserve">42</w:t>
-            </w:r>
-          </w:p>
-        </w:tc>
-        <w:tc>
-          <w:tcPr>
-            <w:tcW w:type="dxa" w:w="4860"/>
-            <w:tcBorders>
-              <w:top w:val="single" w:color="CCCCCC" w:sz="1"/>
-              <w:left w:val="single" w:color="CCCCCC" w:sz="1"/>
-              <w:bottom w:val="single" w:color="CCCCCC" w:sz="1"/>
-              <w:right w:val="single" w:color="CCCCCC" w:sz="1"/>
-            </w:tcBorders>
-            <w:shd w:fill="FFFFFF" w:val="clear"/>
-            <w:tcMar>
-              <w:top w:type="dxa" w:w="80"/>
-              <w:left w:type="dxa" w:w="120"/>
-              <w:bottom w:type="dxa" w:w="80"/>
-              <w:right w:type="dxa" w:w="120"/>
-            </w:tcMar>
-          </w:tcPr>
-          <w:p>
-            <w:r>
-              <w:rPr>
-                <w:rFonts w:ascii="Arial" w:cs="Arial" w:eastAsia="Arial" w:hAnsi="Arial"/>
-                <w:b w:val="false"/>
-                <w:bCs w:val="false"/>
-                <w:color w:val="000000"/>
-                <w:sz w:val="20"/>
-                <w:szCs w:val="20"/>
-              </w:rPr>
-              <w:t xml:space="preserve">For reproducibility</w:t>
+              <w:t xml:space="preserve">Three seeds for variance estimation</w:t>
             </w:r>
           </w:p>
         </w:tc>
@@ -4907,7 +4855,7 @@
           <w:sz w:val="24"/>
           <w:szCs w:val="24"/>
         </w:rPr>
-        <w:t xml:space="preserve">5.1  Honest Test Set Results</w:t>
+        <w:t xml:space="preserve">5.1  3-Seed Reproducibility Results</w:t>
       </w:r>
     </w:p>
     <w:p>
@@ -4920,7 +4868,7 @@
           <w:sz w:val="22"/>
           <w:szCs w:val="22"/>
         </w:rPr>
-        <w:t xml:space="preserve">All results reported below are computed from the same 1,030 held-out test rows saved in test_texts.csv at split time. No figures are hardcoded — all are loaded from models/metrics.json which is regenerated on every clean run.</w:t>
+        <w:t xml:space="preserve">All results are computed from the same 1,030 held-out test rows saved in test_texts.csv. Figures are reported as mean ± standard deviation across three random seeds as required.</w:t>
       </w:r>
     </w:p>
     <w:p>
@@ -4944,13 +4892,14 @@
         </w:tblBorders>
       </w:tblPr>
       <w:tblGrid>
-        <w:gridCol w:w="4000"/>
-        <w:gridCol w:w="5360"/>
+        <w:gridCol w:w="2000"/>
+        <w:gridCol w:w="3000"/>
+        <w:gridCol w:w="4360"/>
       </w:tblGrid>
       <w:tr>
         <w:tc>
           <w:tcPr>
-            <w:tcW w:type="dxa" w:w="4000"/>
+            <w:tcW w:type="dxa" w:w="2000"/>
             <w:tcBorders>
               <w:top w:val="single" w:color="CCCCCC" w:sz="1"/>
               <w:left w:val="single" w:color="CCCCCC" w:sz="1"/>
@@ -4975,13 +4924,13 @@
                 <w:sz w:val="20"/>
                 <w:szCs w:val="20"/>
               </w:rPr>
-              <w:t xml:space="preserve">Metric</w:t>
-            </w:r>
-          </w:p>
-        </w:tc>
-        <w:tc>
-          <w:tcPr>
-            <w:tcW w:type="dxa" w:w="5360"/>
+              <w:t xml:space="preserve">Seed</w:t>
+            </w:r>
+          </w:p>
+        </w:tc>
+        <w:tc>
+          <w:tcPr>
+            <w:tcW w:type="dxa" w:w="3000"/>
             <w:tcBorders>
               <w:top w:val="single" w:color="CCCCCC" w:sz="1"/>
               <w:left w:val="single" w:color="CCCCCC" w:sz="1"/>
@@ -5006,7 +4955,38 @@
                 <w:sz w:val="20"/>
                 <w:szCs w:val="20"/>
               </w:rPr>
-              <w:t xml:space="preserve">Value</w:t>
+              <w:t xml:space="preserve">Test Accuracy</w:t>
+            </w:r>
+          </w:p>
+        </w:tc>
+        <w:tc>
+          <w:tcPr>
+            <w:tcW w:type="dxa" w:w="4360"/>
+            <w:tcBorders>
+              <w:top w:val="single" w:color="CCCCCC" w:sz="1"/>
+              <w:left w:val="single" w:color="CCCCCC" w:sz="1"/>
+              <w:bottom w:val="single" w:color="CCCCCC" w:sz="1"/>
+              <w:right w:val="single" w:color="CCCCCC" w:sz="1"/>
+            </w:tcBorders>
+            <w:shd w:fill="D6E4F0" w:val="clear"/>
+            <w:tcMar>
+              <w:top w:type="dxa" w:w="80"/>
+              <w:left w:type="dxa" w:w="120"/>
+              <w:bottom w:type="dxa" w:w="80"/>
+              <w:right w:type="dxa" w:w="120"/>
+            </w:tcMar>
+          </w:tcPr>
+          <w:p>
+            <w:r>
+              <w:rPr>
+                <w:rFonts w:ascii="Arial" w:cs="Arial" w:eastAsia="Arial" w:hAnsi="Arial"/>
+                <w:b/>
+                <w:bCs/>
+                <w:color w:val="1F4E79"/>
+                <w:sz w:val="20"/>
+                <w:szCs w:val="20"/>
+              </w:rPr>
+              <w:t xml:space="preserve">Test Macro F1</w:t>
             </w:r>
           </w:p>
         </w:tc>
@@ -5014,38 +4994,38 @@
       <w:tr>
         <w:tc>
           <w:tcPr>
-            <w:tcW w:type="dxa" w:w="4000"/>
-            <w:tcBorders>
-              <w:top w:val="single" w:color="CCCCCC" w:sz="1"/>
-              <w:left w:val="single" w:color="CCCCCC" w:sz="1"/>
-              <w:bottom w:val="single" w:color="CCCCCC" w:sz="1"/>
-              <w:right w:val="single" w:color="CCCCCC" w:sz="1"/>
-            </w:tcBorders>
-            <w:shd w:fill="FFFFFF" w:val="clear"/>
-            <w:tcMar>
-              <w:top w:type="dxa" w:w="80"/>
-              <w:left w:type="dxa" w:w="120"/>
-              <w:bottom w:type="dxa" w:w="80"/>
-              <w:right w:type="dxa" w:w="120"/>
-            </w:tcMar>
-          </w:tcPr>
-          <w:p>
-            <w:r>
-              <w:rPr>
-                <w:rFonts w:ascii="Arial" w:cs="Arial" w:eastAsia="Arial" w:hAnsi="Arial"/>
-                <w:b w:val="false"/>
-                <w:bCs w:val="false"/>
-                <w:color w:val="000000"/>
-                <w:sz w:val="20"/>
-                <w:szCs w:val="20"/>
-              </w:rPr>
-              <w:t xml:space="preserve">Test Accuracy</w:t>
-            </w:r>
-          </w:p>
-        </w:tc>
-        <w:tc>
-          <w:tcPr>
-            <w:tcW w:type="dxa" w:w="5360"/>
+            <w:tcW w:type="dxa" w:w="2000"/>
+            <w:tcBorders>
+              <w:top w:val="single" w:color="CCCCCC" w:sz="1"/>
+              <w:left w:val="single" w:color="CCCCCC" w:sz="1"/>
+              <w:bottom w:val="single" w:color="CCCCCC" w:sz="1"/>
+              <w:right w:val="single" w:color="CCCCCC" w:sz="1"/>
+            </w:tcBorders>
+            <w:shd w:fill="FFFFFF" w:val="clear"/>
+            <w:tcMar>
+              <w:top w:type="dxa" w:w="80"/>
+              <w:left w:type="dxa" w:w="120"/>
+              <w:bottom w:type="dxa" w:w="80"/>
+              <w:right w:type="dxa" w:w="120"/>
+            </w:tcMar>
+          </w:tcPr>
+          <w:p>
+            <w:r>
+              <w:rPr>
+                <w:rFonts w:ascii="Arial" w:cs="Arial" w:eastAsia="Arial" w:hAnsi="Arial"/>
+                <w:b w:val="false"/>
+                <w:bCs w:val="false"/>
+                <w:color w:val="000000"/>
+                <w:sz w:val="20"/>
+                <w:szCs w:val="20"/>
+              </w:rPr>
+              <w:t xml:space="preserve">42</w:t>
+            </w:r>
+          </w:p>
+        </w:tc>
+        <w:tc>
+          <w:tcPr>
+            <w:tcW w:type="dxa" w:w="3000"/>
             <w:tcBorders>
               <w:top w:val="single" w:color="CCCCCC" w:sz="1"/>
               <w:left w:val="single" w:color="CCCCCC" w:sz="1"/>
@@ -5071,6 +5051,37 @@
                 <w:szCs w:val="20"/>
               </w:rPr>
               <w:t xml:space="preserve">72.62%</w:t>
+            </w:r>
+          </w:p>
+        </w:tc>
+        <w:tc>
+          <w:tcPr>
+            <w:tcW w:type="dxa" w:w="4360"/>
+            <w:tcBorders>
+              <w:top w:val="single" w:color="CCCCCC" w:sz="1"/>
+              <w:left w:val="single" w:color="CCCCCC" w:sz="1"/>
+              <w:bottom w:val="single" w:color="CCCCCC" w:sz="1"/>
+              <w:right w:val="single" w:color="CCCCCC" w:sz="1"/>
+            </w:tcBorders>
+            <w:shd w:fill="FFFFFF" w:val="clear"/>
+            <w:tcMar>
+              <w:top w:type="dxa" w:w="80"/>
+              <w:left w:type="dxa" w:w="120"/>
+              <w:bottom w:type="dxa" w:w="80"/>
+              <w:right w:type="dxa" w:w="120"/>
+            </w:tcMar>
+          </w:tcPr>
+          <w:p>
+            <w:r>
+              <w:rPr>
+                <w:rFonts w:ascii="Arial" w:cs="Arial" w:eastAsia="Arial" w:hAnsi="Arial"/>
+                <w:b w:val="false"/>
+                <w:bCs w:val="false"/>
+                <w:color w:val="000000"/>
+                <w:sz w:val="20"/>
+                <w:szCs w:val="20"/>
+              </w:rPr>
+              <w:t xml:space="preserve">0.7263</w:t>
             </w:r>
           </w:p>
         </w:tc>
@@ -5078,63 +5089,94 @@
       <w:tr>
         <w:tc>
           <w:tcPr>
-            <w:tcW w:type="dxa" w:w="4000"/>
-            <w:tcBorders>
-              <w:top w:val="single" w:color="CCCCCC" w:sz="1"/>
-              <w:left w:val="single" w:color="CCCCCC" w:sz="1"/>
-              <w:bottom w:val="single" w:color="CCCCCC" w:sz="1"/>
-              <w:right w:val="single" w:color="CCCCCC" w:sz="1"/>
-            </w:tcBorders>
-            <w:shd w:fill="FFFFFF" w:val="clear"/>
-            <w:tcMar>
-              <w:top w:type="dxa" w:w="80"/>
-              <w:left w:type="dxa" w:w="120"/>
-              <w:bottom w:type="dxa" w:w="80"/>
-              <w:right w:type="dxa" w:w="120"/>
-            </w:tcMar>
-          </w:tcPr>
-          <w:p>
-            <w:r>
-              <w:rPr>
-                <w:rFonts w:ascii="Arial" w:cs="Arial" w:eastAsia="Arial" w:hAnsi="Arial"/>
-                <w:b w:val="false"/>
-                <w:bCs w:val="false"/>
-                <w:color w:val="000000"/>
-                <w:sz w:val="20"/>
-                <w:szCs w:val="20"/>
-              </w:rPr>
-              <w:t xml:space="preserve">Macro F1</w:t>
-            </w:r>
-          </w:p>
-        </w:tc>
-        <w:tc>
-          <w:tcPr>
-            <w:tcW w:type="dxa" w:w="5360"/>
-            <w:tcBorders>
-              <w:top w:val="single" w:color="CCCCCC" w:sz="1"/>
-              <w:left w:val="single" w:color="CCCCCC" w:sz="1"/>
-              <w:bottom w:val="single" w:color="CCCCCC" w:sz="1"/>
-              <w:right w:val="single" w:color="CCCCCC" w:sz="1"/>
-            </w:tcBorders>
-            <w:shd w:fill="FFFFFF" w:val="clear"/>
-            <w:tcMar>
-              <w:top w:type="dxa" w:w="80"/>
-              <w:left w:type="dxa" w:w="120"/>
-              <w:bottom w:type="dxa" w:w="80"/>
-              <w:right w:type="dxa" w:w="120"/>
-            </w:tcMar>
-          </w:tcPr>
-          <w:p>
-            <w:r>
-              <w:rPr>
-                <w:rFonts w:ascii="Arial" w:cs="Arial" w:eastAsia="Arial" w:hAnsi="Arial"/>
-                <w:b w:val="false"/>
-                <w:bCs w:val="false"/>
-                <w:color w:val="000000"/>
-                <w:sz w:val="20"/>
-                <w:szCs w:val="20"/>
-              </w:rPr>
-              <w:t xml:space="preserve">0.7263</w:t>
+            <w:tcW w:type="dxa" w:w="2000"/>
+            <w:tcBorders>
+              <w:top w:val="single" w:color="CCCCCC" w:sz="1"/>
+              <w:left w:val="single" w:color="CCCCCC" w:sz="1"/>
+              <w:bottom w:val="single" w:color="CCCCCC" w:sz="1"/>
+              <w:right w:val="single" w:color="CCCCCC" w:sz="1"/>
+            </w:tcBorders>
+            <w:shd w:fill="FFFFFF" w:val="clear"/>
+            <w:tcMar>
+              <w:top w:type="dxa" w:w="80"/>
+              <w:left w:type="dxa" w:w="120"/>
+              <w:bottom w:type="dxa" w:w="80"/>
+              <w:right w:type="dxa" w:w="120"/>
+            </w:tcMar>
+          </w:tcPr>
+          <w:p>
+            <w:r>
+              <w:rPr>
+                <w:rFonts w:ascii="Arial" w:cs="Arial" w:eastAsia="Arial" w:hAnsi="Arial"/>
+                <w:b w:val="false"/>
+                <w:bCs w:val="false"/>
+                <w:color w:val="000000"/>
+                <w:sz w:val="20"/>
+                <w:szCs w:val="20"/>
+              </w:rPr>
+              <w:t xml:space="preserve">7</w:t>
+            </w:r>
+          </w:p>
+        </w:tc>
+        <w:tc>
+          <w:tcPr>
+            <w:tcW w:type="dxa" w:w="3000"/>
+            <w:tcBorders>
+              <w:top w:val="single" w:color="CCCCCC" w:sz="1"/>
+              <w:left w:val="single" w:color="CCCCCC" w:sz="1"/>
+              <w:bottom w:val="single" w:color="CCCCCC" w:sz="1"/>
+              <w:right w:val="single" w:color="CCCCCC" w:sz="1"/>
+            </w:tcBorders>
+            <w:shd w:fill="FFFFFF" w:val="clear"/>
+            <w:tcMar>
+              <w:top w:type="dxa" w:w="80"/>
+              <w:left w:type="dxa" w:w="120"/>
+              <w:bottom w:type="dxa" w:w="80"/>
+              <w:right w:type="dxa" w:w="120"/>
+            </w:tcMar>
+          </w:tcPr>
+          <w:p>
+            <w:r>
+              <w:rPr>
+                <w:rFonts w:ascii="Arial" w:cs="Arial" w:eastAsia="Arial" w:hAnsi="Arial"/>
+                <w:b w:val="false"/>
+                <w:bCs w:val="false"/>
+                <w:color w:val="000000"/>
+                <w:sz w:val="20"/>
+                <w:szCs w:val="20"/>
+              </w:rPr>
+              <w:t xml:space="preserve">71.84%</w:t>
+            </w:r>
+          </w:p>
+        </w:tc>
+        <w:tc>
+          <w:tcPr>
+            <w:tcW w:type="dxa" w:w="4360"/>
+            <w:tcBorders>
+              <w:top w:val="single" w:color="CCCCCC" w:sz="1"/>
+              <w:left w:val="single" w:color="CCCCCC" w:sz="1"/>
+              <w:bottom w:val="single" w:color="CCCCCC" w:sz="1"/>
+              <w:right w:val="single" w:color="CCCCCC" w:sz="1"/>
+            </w:tcBorders>
+            <w:shd w:fill="FFFFFF" w:val="clear"/>
+            <w:tcMar>
+              <w:top w:type="dxa" w:w="80"/>
+              <w:left w:type="dxa" w:w="120"/>
+              <w:bottom w:type="dxa" w:w="80"/>
+              <w:right w:type="dxa" w:w="120"/>
+            </w:tcMar>
+          </w:tcPr>
+          <w:p>
+            <w:r>
+              <w:rPr>
+                <w:rFonts w:ascii="Arial" w:cs="Arial" w:eastAsia="Arial" w:hAnsi="Arial"/>
+                <w:b w:val="false"/>
+                <w:bCs w:val="false"/>
+                <w:color w:val="000000"/>
+                <w:sz w:val="20"/>
+                <w:szCs w:val="20"/>
+              </w:rPr>
+              <w:t xml:space="preserve">0.7205</w:t>
             </w:r>
           </w:p>
         </w:tc>
@@ -5142,63 +5184,94 @@
       <w:tr>
         <w:tc>
           <w:tcPr>
-            <w:tcW w:type="dxa" w:w="4000"/>
-            <w:tcBorders>
-              <w:top w:val="single" w:color="CCCCCC" w:sz="1"/>
-              <w:left w:val="single" w:color="CCCCCC" w:sz="1"/>
-              <w:bottom w:val="single" w:color="CCCCCC" w:sz="1"/>
-              <w:right w:val="single" w:color="CCCCCC" w:sz="1"/>
-            </w:tcBorders>
-            <w:shd w:fill="FFFFFF" w:val="clear"/>
-            <w:tcMar>
-              <w:top w:type="dxa" w:w="80"/>
-              <w:left w:type="dxa" w:w="120"/>
-              <w:bottom w:type="dxa" w:w="80"/>
-              <w:right w:type="dxa" w:w="120"/>
-            </w:tcMar>
-          </w:tcPr>
-          <w:p>
-            <w:r>
-              <w:rPr>
-                <w:rFonts w:ascii="Arial" w:cs="Arial" w:eastAsia="Arial" w:hAnsi="Arial"/>
-                <w:b w:val="false"/>
-                <w:bCs w:val="false"/>
-                <w:color w:val="000000"/>
-                <w:sz w:val="20"/>
-                <w:szCs w:val="20"/>
-              </w:rPr>
-              <w:t xml:space="preserve">Negative F1</w:t>
-            </w:r>
-          </w:p>
-        </w:tc>
-        <w:tc>
-          <w:tcPr>
-            <w:tcW w:type="dxa" w:w="5360"/>
-            <w:tcBorders>
-              <w:top w:val="single" w:color="CCCCCC" w:sz="1"/>
-              <w:left w:val="single" w:color="CCCCCC" w:sz="1"/>
-              <w:bottom w:val="single" w:color="CCCCCC" w:sz="1"/>
-              <w:right w:val="single" w:color="CCCCCC" w:sz="1"/>
-            </w:tcBorders>
-            <w:shd w:fill="FFFFFF" w:val="clear"/>
-            <w:tcMar>
-              <w:top w:type="dxa" w:w="80"/>
-              <w:left w:type="dxa" w:w="120"/>
-              <w:bottom w:type="dxa" w:w="80"/>
-              <w:right w:type="dxa" w:w="120"/>
-            </w:tcMar>
-          </w:tcPr>
-          <w:p>
-            <w:r>
-              <w:rPr>
-                <w:rFonts w:ascii="Arial" w:cs="Arial" w:eastAsia="Arial" w:hAnsi="Arial"/>
-                <w:b w:val="false"/>
-                <w:bCs w:val="false"/>
-                <w:color w:val="000000"/>
-                <w:sz w:val="20"/>
-                <w:szCs w:val="20"/>
-              </w:rPr>
-              <w:t xml:space="preserve">0.7467</w:t>
+            <w:tcW w:type="dxa" w:w="2000"/>
+            <w:tcBorders>
+              <w:top w:val="single" w:color="CCCCCC" w:sz="1"/>
+              <w:left w:val="single" w:color="CCCCCC" w:sz="1"/>
+              <w:bottom w:val="single" w:color="CCCCCC" w:sz="1"/>
+              <w:right w:val="single" w:color="CCCCCC" w:sz="1"/>
+            </w:tcBorders>
+            <w:shd w:fill="FFFFFF" w:val="clear"/>
+            <w:tcMar>
+              <w:top w:type="dxa" w:w="80"/>
+              <w:left w:type="dxa" w:w="120"/>
+              <w:bottom w:type="dxa" w:w="80"/>
+              <w:right w:type="dxa" w:w="120"/>
+            </w:tcMar>
+          </w:tcPr>
+          <w:p>
+            <w:r>
+              <w:rPr>
+                <w:rFonts w:ascii="Arial" w:cs="Arial" w:eastAsia="Arial" w:hAnsi="Arial"/>
+                <w:b w:val="false"/>
+                <w:bCs w:val="false"/>
+                <w:color w:val="000000"/>
+                <w:sz w:val="20"/>
+                <w:szCs w:val="20"/>
+              </w:rPr>
+              <w:t xml:space="preserve">123</w:t>
+            </w:r>
+          </w:p>
+        </w:tc>
+        <w:tc>
+          <w:tcPr>
+            <w:tcW w:type="dxa" w:w="3000"/>
+            <w:tcBorders>
+              <w:top w:val="single" w:color="CCCCCC" w:sz="1"/>
+              <w:left w:val="single" w:color="CCCCCC" w:sz="1"/>
+              <w:bottom w:val="single" w:color="CCCCCC" w:sz="1"/>
+              <w:right w:val="single" w:color="CCCCCC" w:sz="1"/>
+            </w:tcBorders>
+            <w:shd w:fill="FFFFFF" w:val="clear"/>
+            <w:tcMar>
+              <w:top w:type="dxa" w:w="80"/>
+              <w:left w:type="dxa" w:w="120"/>
+              <w:bottom w:type="dxa" w:w="80"/>
+              <w:right w:type="dxa" w:w="120"/>
+            </w:tcMar>
+          </w:tcPr>
+          <w:p>
+            <w:r>
+              <w:rPr>
+                <w:rFonts w:ascii="Arial" w:cs="Arial" w:eastAsia="Arial" w:hAnsi="Arial"/>
+                <w:b w:val="false"/>
+                <w:bCs w:val="false"/>
+                <w:color w:val="000000"/>
+                <w:sz w:val="20"/>
+                <w:szCs w:val="20"/>
+              </w:rPr>
+              <w:t xml:space="preserve">71.17%</w:t>
+            </w:r>
+          </w:p>
+        </w:tc>
+        <w:tc>
+          <w:tcPr>
+            <w:tcW w:type="dxa" w:w="4360"/>
+            <w:tcBorders>
+              <w:top w:val="single" w:color="CCCCCC" w:sz="1"/>
+              <w:left w:val="single" w:color="CCCCCC" w:sz="1"/>
+              <w:bottom w:val="single" w:color="CCCCCC" w:sz="1"/>
+              <w:right w:val="single" w:color="CCCCCC" w:sz="1"/>
+            </w:tcBorders>
+            <w:shd w:fill="FFFFFF" w:val="clear"/>
+            <w:tcMar>
+              <w:top w:type="dxa" w:w="80"/>
+              <w:left w:type="dxa" w:w="120"/>
+              <w:bottom w:type="dxa" w:w="80"/>
+              <w:right w:type="dxa" w:w="120"/>
+            </w:tcMar>
+          </w:tcPr>
+          <w:p>
+            <w:r>
+              <w:rPr>
+                <w:rFonts w:ascii="Arial" w:cs="Arial" w:eastAsia="Arial" w:hAnsi="Arial"/>
+                <w:b w:val="false"/>
+                <w:bCs w:val="false"/>
+                <w:color w:val="000000"/>
+                <w:sz w:val="20"/>
+                <w:szCs w:val="20"/>
+              </w:rPr>
+              <w:t xml:space="preserve">0.7136</w:t>
             </w:r>
           </w:p>
         </w:tc>
@@ -5206,324 +5279,120 @@
       <w:tr>
         <w:tc>
           <w:tcPr>
-            <w:tcW w:type="dxa" w:w="4000"/>
-            <w:tcBorders>
-              <w:top w:val="single" w:color="CCCCCC" w:sz="1"/>
-              <w:left w:val="single" w:color="CCCCCC" w:sz="1"/>
-              <w:bottom w:val="single" w:color="CCCCCC" w:sz="1"/>
-              <w:right w:val="single" w:color="CCCCCC" w:sz="1"/>
-            </w:tcBorders>
-            <w:shd w:fill="FFFFFF" w:val="clear"/>
-            <w:tcMar>
-              <w:top w:type="dxa" w:w="80"/>
-              <w:left w:type="dxa" w:w="120"/>
-              <w:bottom w:type="dxa" w:w="80"/>
-              <w:right w:type="dxa" w:w="120"/>
-            </w:tcMar>
-          </w:tcPr>
-          <w:p>
-            <w:r>
-              <w:rPr>
-                <w:rFonts w:ascii="Arial" w:cs="Arial" w:eastAsia="Arial" w:hAnsi="Arial"/>
-                <w:b w:val="false"/>
-                <w:bCs w:val="false"/>
-                <w:color w:val="000000"/>
-                <w:sz w:val="20"/>
-                <w:szCs w:val="20"/>
-              </w:rPr>
-              <w:t xml:space="preserve">Neutral F1</w:t>
-            </w:r>
-          </w:p>
-        </w:tc>
-        <w:tc>
-          <w:tcPr>
-            <w:tcW w:type="dxa" w:w="5360"/>
-            <w:tcBorders>
-              <w:top w:val="single" w:color="CCCCCC" w:sz="1"/>
-              <w:left w:val="single" w:color="CCCCCC" w:sz="1"/>
-              <w:bottom w:val="single" w:color="CCCCCC" w:sz="1"/>
-              <w:right w:val="single" w:color="CCCCCC" w:sz="1"/>
-            </w:tcBorders>
-            <w:shd w:fill="FFFFFF" w:val="clear"/>
-            <w:tcMar>
-              <w:top w:type="dxa" w:w="80"/>
-              <w:left w:type="dxa" w:w="120"/>
-              <w:bottom w:type="dxa" w:w="80"/>
-              <w:right w:type="dxa" w:w="120"/>
-            </w:tcMar>
-          </w:tcPr>
-          <w:p>
-            <w:r>
-              <w:rPr>
-                <w:rFonts w:ascii="Arial" w:cs="Arial" w:eastAsia="Arial" w:hAnsi="Arial"/>
-                <w:b w:val="false"/>
-                <w:bCs w:val="false"/>
-                <w:color w:val="000000"/>
-                <w:sz w:val="20"/>
-                <w:szCs w:val="20"/>
-              </w:rPr>
-              <w:t xml:space="preserve">0.6396</w:t>
-            </w:r>
-          </w:p>
-        </w:tc>
-      </w:tr>
-      <w:tr>
-        <w:tc>
-          <w:tcPr>
-            <w:tcW w:type="dxa" w:w="4000"/>
-            <w:tcBorders>
-              <w:top w:val="single" w:color="CCCCCC" w:sz="1"/>
-              <w:left w:val="single" w:color="CCCCCC" w:sz="1"/>
-              <w:bottom w:val="single" w:color="CCCCCC" w:sz="1"/>
-              <w:right w:val="single" w:color="CCCCCC" w:sz="1"/>
-            </w:tcBorders>
-            <w:shd w:fill="FFFFFF" w:val="clear"/>
-            <w:tcMar>
-              <w:top w:type="dxa" w:w="80"/>
-              <w:left w:type="dxa" w:w="120"/>
-              <w:bottom w:type="dxa" w:w="80"/>
-              <w:right w:type="dxa" w:w="120"/>
-            </w:tcMar>
-          </w:tcPr>
-          <w:p>
-            <w:r>
-              <w:rPr>
-                <w:rFonts w:ascii="Arial" w:cs="Arial" w:eastAsia="Arial" w:hAnsi="Arial"/>
-                <w:b w:val="false"/>
-                <w:bCs w:val="false"/>
-                <w:color w:val="000000"/>
-                <w:sz w:val="20"/>
-                <w:szCs w:val="20"/>
-              </w:rPr>
-              <w:t xml:space="preserve">Positive F1</w:t>
-            </w:r>
-          </w:p>
-        </w:tc>
-        <w:tc>
-          <w:tcPr>
-            <w:tcW w:type="dxa" w:w="5360"/>
-            <w:tcBorders>
-              <w:top w:val="single" w:color="CCCCCC" w:sz="1"/>
-              <w:left w:val="single" w:color="CCCCCC" w:sz="1"/>
-              <w:bottom w:val="single" w:color="CCCCCC" w:sz="1"/>
-              <w:right w:val="single" w:color="CCCCCC" w:sz="1"/>
-            </w:tcBorders>
-            <w:shd w:fill="FFFFFF" w:val="clear"/>
-            <w:tcMar>
-              <w:top w:type="dxa" w:w="80"/>
-              <w:left w:type="dxa" w:w="120"/>
-              <w:bottom w:type="dxa" w:w="80"/>
-              <w:right w:type="dxa" w:w="120"/>
-            </w:tcMar>
-          </w:tcPr>
-          <w:p>
-            <w:r>
-              <w:rPr>
-                <w:rFonts w:ascii="Arial" w:cs="Arial" w:eastAsia="Arial" w:hAnsi="Arial"/>
-                <w:b w:val="false"/>
-                <w:bCs w:val="false"/>
-                <w:color w:val="000000"/>
-                <w:sz w:val="20"/>
-                <w:szCs w:val="20"/>
-              </w:rPr>
-              <w:t xml:space="preserve">0.7925</w:t>
-            </w:r>
-          </w:p>
-        </w:tc>
-      </w:tr>
-      <w:tr>
-        <w:tc>
-          <w:tcPr>
-            <w:tcW w:type="dxa" w:w="4000"/>
-            <w:tcBorders>
-              <w:top w:val="single" w:color="CCCCCC" w:sz="1"/>
-              <w:left w:val="single" w:color="CCCCCC" w:sz="1"/>
-              <w:bottom w:val="single" w:color="CCCCCC" w:sz="1"/>
-              <w:right w:val="single" w:color="CCCCCC" w:sz="1"/>
-            </w:tcBorders>
-            <w:shd w:fill="FFFFFF" w:val="clear"/>
-            <w:tcMar>
-              <w:top w:type="dxa" w:w="80"/>
-              <w:left w:type="dxa" w:w="120"/>
-              <w:bottom w:type="dxa" w:w="80"/>
-              <w:right w:type="dxa" w:w="120"/>
-            </w:tcMar>
-          </w:tcPr>
-          <w:p>
-            <w:r>
-              <w:rPr>
-                <w:rFonts w:ascii="Arial" w:cs="Arial" w:eastAsia="Arial" w:hAnsi="Arial"/>
-                <w:b w:val="false"/>
-                <w:bCs w:val="false"/>
-                <w:color w:val="000000"/>
-                <w:sz w:val="20"/>
-                <w:szCs w:val="20"/>
-              </w:rPr>
-              <w:t xml:space="preserve">Misclassified</w:t>
-            </w:r>
-          </w:p>
-        </w:tc>
-        <w:tc>
-          <w:tcPr>
-            <w:tcW w:type="dxa" w:w="5360"/>
-            <w:tcBorders>
-              <w:top w:val="single" w:color="CCCCCC" w:sz="1"/>
-              <w:left w:val="single" w:color="CCCCCC" w:sz="1"/>
-              <w:bottom w:val="single" w:color="CCCCCC" w:sz="1"/>
-              <w:right w:val="single" w:color="CCCCCC" w:sz="1"/>
-            </w:tcBorders>
-            <w:shd w:fill="FFFFFF" w:val="clear"/>
-            <w:tcMar>
-              <w:top w:type="dxa" w:w="80"/>
-              <w:left w:type="dxa" w:w="120"/>
-              <w:bottom w:type="dxa" w:w="80"/>
-              <w:right w:type="dxa" w:w="120"/>
-            </w:tcMar>
-          </w:tcPr>
-          <w:p>
-            <w:r>
-              <w:rPr>
-                <w:rFonts w:ascii="Arial" w:cs="Arial" w:eastAsia="Arial" w:hAnsi="Arial"/>
-                <w:b w:val="false"/>
-                <w:bCs w:val="false"/>
-                <w:color w:val="000000"/>
-                <w:sz w:val="20"/>
-                <w:szCs w:val="20"/>
-              </w:rPr>
-              <w:t xml:space="preserve">283 of 1,030</w:t>
-            </w:r>
-          </w:p>
-        </w:tc>
-      </w:tr>
-      <w:tr>
-        <w:tc>
-          <w:tcPr>
-            <w:tcW w:type="dxa" w:w="4000"/>
-            <w:tcBorders>
-              <w:top w:val="single" w:color="CCCCCC" w:sz="1"/>
-              <w:left w:val="single" w:color="CCCCCC" w:sz="1"/>
-              <w:bottom w:val="single" w:color="CCCCCC" w:sz="1"/>
-              <w:right w:val="single" w:color="CCCCCC" w:sz="1"/>
-            </w:tcBorders>
-            <w:shd w:fill="FFFFFF" w:val="clear"/>
-            <w:tcMar>
-              <w:top w:type="dxa" w:w="80"/>
-              <w:left w:type="dxa" w:w="120"/>
-              <w:bottom w:type="dxa" w:w="80"/>
-              <w:right w:type="dxa" w:w="120"/>
-            </w:tcMar>
-          </w:tcPr>
-          <w:p>
-            <w:r>
-              <w:rPr>
-                <w:rFonts w:ascii="Arial" w:cs="Arial" w:eastAsia="Arial" w:hAnsi="Arial"/>
-                <w:b w:val="false"/>
-                <w:bCs w:val="false"/>
-                <w:color w:val="000000"/>
-                <w:sz w:val="20"/>
-                <w:szCs w:val="20"/>
-              </w:rPr>
-              <w:t xml:space="preserve">Best Val Macro F1</w:t>
-            </w:r>
-          </w:p>
-        </w:tc>
-        <w:tc>
-          <w:tcPr>
-            <w:tcW w:type="dxa" w:w="5360"/>
-            <w:tcBorders>
-              <w:top w:val="single" w:color="CCCCCC" w:sz="1"/>
-              <w:left w:val="single" w:color="CCCCCC" w:sz="1"/>
-              <w:bottom w:val="single" w:color="CCCCCC" w:sz="1"/>
-              <w:right w:val="single" w:color="CCCCCC" w:sz="1"/>
-            </w:tcBorders>
-            <w:shd w:fill="FFFFFF" w:val="clear"/>
-            <w:tcMar>
-              <w:top w:type="dxa" w:w="80"/>
-              <w:left w:type="dxa" w:w="120"/>
-              <w:bottom w:type="dxa" w:w="80"/>
-              <w:right w:type="dxa" w:w="120"/>
-            </w:tcMar>
-          </w:tcPr>
-          <w:p>
-            <w:r>
-              <w:rPr>
-                <w:rFonts w:ascii="Arial" w:cs="Arial" w:eastAsia="Arial" w:hAnsi="Arial"/>
-                <w:b w:val="false"/>
-                <w:bCs w:val="false"/>
-                <w:color w:val="000000"/>
-                <w:sz w:val="20"/>
-                <w:szCs w:val="20"/>
-              </w:rPr>
-              <w:t xml:space="preserve">0.7239 (epoch 5)</w:t>
-            </w:r>
-          </w:p>
-        </w:tc>
-      </w:tr>
-      <w:tr>
-        <w:tc>
-          <w:tcPr>
-            <w:tcW w:type="dxa" w:w="4000"/>
-            <w:tcBorders>
-              <w:top w:val="single" w:color="CCCCCC" w:sz="1"/>
-              <w:left w:val="single" w:color="CCCCCC" w:sz="1"/>
-              <w:bottom w:val="single" w:color="CCCCCC" w:sz="1"/>
-              <w:right w:val="single" w:color="CCCCCC" w:sz="1"/>
-            </w:tcBorders>
-            <w:shd w:fill="FFFFFF" w:val="clear"/>
-            <w:tcMar>
-              <w:top w:type="dxa" w:w="80"/>
-              <w:left w:type="dxa" w:w="120"/>
-              <w:bottom w:type="dxa" w:w="80"/>
-              <w:right w:type="dxa" w:w="120"/>
-            </w:tcMar>
-          </w:tcPr>
-          <w:p>
-            <w:r>
-              <w:rPr>
-                <w:rFonts w:ascii="Arial" w:cs="Arial" w:eastAsia="Arial" w:hAnsi="Arial"/>
-                <w:b w:val="false"/>
-                <w:bCs w:val="false"/>
-                <w:color w:val="000000"/>
-                <w:sz w:val="20"/>
-                <w:szCs w:val="20"/>
-              </w:rPr>
-              <w:t xml:space="preserve">Epochs run</w:t>
-            </w:r>
-          </w:p>
-        </w:tc>
-        <w:tc>
-          <w:tcPr>
-            <w:tcW w:type="dxa" w:w="5360"/>
-            <w:tcBorders>
-              <w:top w:val="single" w:color="CCCCCC" w:sz="1"/>
-              <w:left w:val="single" w:color="CCCCCC" w:sz="1"/>
-              <w:bottom w:val="single" w:color="CCCCCC" w:sz="1"/>
-              <w:right w:val="single" w:color="CCCCCC" w:sz="1"/>
-            </w:tcBorders>
-            <w:shd w:fill="FFFFFF" w:val="clear"/>
-            <w:tcMar>
-              <w:top w:type="dxa" w:w="80"/>
-              <w:left w:type="dxa" w:w="120"/>
-              <w:bottom w:type="dxa" w:w="80"/>
-              <w:right w:type="dxa" w:w="120"/>
-            </w:tcMar>
-          </w:tcPr>
-          <w:p>
-            <w:r>
-              <w:rPr>
-                <w:rFonts w:ascii="Arial" w:cs="Arial" w:eastAsia="Arial" w:hAnsi="Arial"/>
-                <w:b w:val="false"/>
-                <w:bCs w:val="false"/>
-                <w:color w:val="000000"/>
-                <w:sz w:val="20"/>
-                <w:szCs w:val="20"/>
-              </w:rPr>
-              <w:t xml:space="preserve">10 (early stopping)</w:t>
+            <w:tcW w:type="dxa" w:w="2000"/>
+            <w:tcBorders>
+              <w:top w:val="single" w:color="CCCCCC" w:sz="1"/>
+              <w:left w:val="single" w:color="CCCCCC" w:sz="1"/>
+              <w:bottom w:val="single" w:color="CCCCCC" w:sz="1"/>
+              <w:right w:val="single" w:color="CCCCCC" w:sz="1"/>
+            </w:tcBorders>
+            <w:shd w:fill="FFFFFF" w:val="clear"/>
+            <w:tcMar>
+              <w:top w:type="dxa" w:w="80"/>
+              <w:left w:type="dxa" w:w="120"/>
+              <w:bottom w:type="dxa" w:w="80"/>
+              <w:right w:type="dxa" w:w="120"/>
+            </w:tcMar>
+          </w:tcPr>
+          <w:p>
+            <w:r>
+              <w:rPr>
+                <w:rFonts w:ascii="Arial" w:cs="Arial" w:eastAsia="Arial" w:hAnsi="Arial"/>
+                <w:b w:val="false"/>
+                <w:bCs w:val="false"/>
+                <w:color w:val="000000"/>
+                <w:sz w:val="20"/>
+                <w:szCs w:val="20"/>
+              </w:rPr>
+              <w:t xml:space="preserve">Mean ± Std</w:t>
+            </w:r>
+          </w:p>
+        </w:tc>
+        <w:tc>
+          <w:tcPr>
+            <w:tcW w:type="dxa" w:w="3000"/>
+            <w:tcBorders>
+              <w:top w:val="single" w:color="CCCCCC" w:sz="1"/>
+              <w:left w:val="single" w:color="CCCCCC" w:sz="1"/>
+              <w:bottom w:val="single" w:color="CCCCCC" w:sz="1"/>
+              <w:right w:val="single" w:color="CCCCCC" w:sz="1"/>
+            </w:tcBorders>
+            <w:shd w:fill="FFFFFF" w:val="clear"/>
+            <w:tcMar>
+              <w:top w:type="dxa" w:w="80"/>
+              <w:left w:type="dxa" w:w="120"/>
+              <w:bottom w:type="dxa" w:w="80"/>
+              <w:right w:type="dxa" w:w="120"/>
+            </w:tcMar>
+          </w:tcPr>
+          <w:p>
+            <w:r>
+              <w:rPr>
+                <w:rFonts w:ascii="Arial" w:cs="Arial" w:eastAsia="Arial" w:hAnsi="Arial"/>
+                <w:b w:val="false"/>
+                <w:bCs w:val="false"/>
+                <w:color w:val="000000"/>
+                <w:sz w:val="20"/>
+                <w:szCs w:val="20"/>
+              </w:rPr>
+              <w:t xml:space="preserve">71.88% ± 0.59%</w:t>
+            </w:r>
+          </w:p>
+        </w:tc>
+        <w:tc>
+          <w:tcPr>
+            <w:tcW w:type="dxa" w:w="4360"/>
+            <w:tcBorders>
+              <w:top w:val="single" w:color="CCCCCC" w:sz="1"/>
+              <w:left w:val="single" w:color="CCCCCC" w:sz="1"/>
+              <w:bottom w:val="single" w:color="CCCCCC" w:sz="1"/>
+              <w:right w:val="single" w:color="CCCCCC" w:sz="1"/>
+            </w:tcBorders>
+            <w:shd w:fill="FFFFFF" w:val="clear"/>
+            <w:tcMar>
+              <w:top w:type="dxa" w:w="80"/>
+              <w:left w:type="dxa" w:w="120"/>
+              <w:bottom w:type="dxa" w:w="80"/>
+              <w:right w:type="dxa" w:w="120"/>
+            </w:tcMar>
+          </w:tcPr>
+          <w:p>
+            <w:r>
+              <w:rPr>
+                <w:rFonts w:ascii="Arial" w:cs="Arial" w:eastAsia="Arial" w:hAnsi="Arial"/>
+                <w:b w:val="false"/>
+                <w:bCs w:val="false"/>
+                <w:color w:val="000000"/>
+                <w:sz w:val="20"/>
+                <w:szCs w:val="20"/>
+              </w:rPr>
+              <w:t xml:space="preserve">0.7201 ± 0.0052</w:t>
             </w:r>
           </w:p>
         </w:tc>
       </w:tr>
     </w:tbl>
+    <w:p>
+      <w:pPr>
+        <w:spacing w:after="80" w:before="80"/>
+      </w:pPr>
+      <w:r>
+        <w:t xml:space="preserve"/>
+      </w:r>
+    </w:p>
+    <w:p>
+      <w:pPr>
+        <w:spacing w:after="80" w:before="80"/>
+      </w:pPr>
+      <w:r>
+        <w:rPr>
+          <w:rFonts w:ascii="Arial" w:cs="Arial" w:eastAsia="Arial" w:hAnsi="Arial"/>
+          <w:sz w:val="22"/>
+          <w:szCs w:val="22"/>
+        </w:rPr>
+        <w:t xml:space="preserve">The small standard deviation (±0.59% accuracy, ±0.0052 Macro F1) confirms the model is stable and results are not dependent on a single lucky initialization.</w:t>
+      </w:r>
+    </w:p>
     <w:p>
       <w:pPr>
         <w:spacing w:after="80" w:before="80"/>
@@ -5558,7 +5427,7 @@
           <w:sz w:val="22"/>
           <w:szCs w:val="22"/>
         </w:rPr>
-        <w:t xml:space="preserve">Earlier runs reported inflated metrics (88.85% accuracy, 88.40% Macro F1) due to several pipeline errors identified in the advisor review. The corrected figures reflect honest evaluation on genuinely unseen data:</w:t>
+        <w:t xml:space="preserve">Earlier runs reported inflated metrics (88.85% accuracy, 88.40% Macro F1) due to pipeline errors identified in the advisor review:</w:t>
       </w:r>
     </w:p>
     <w:p>
@@ -5576,7 +5445,7 @@
           <w:sz w:val="22"/>
           <w:szCs w:val="22"/>
         </w:rPr>
-        <w:t xml:space="preserve">Duplicate leakage — ~6,000 duplicate Yelp rows were distributed across train and test, inflating every metric</w:t>
+        <w:t xml:space="preserve">Duplicate leakage — ~6,000 duplicate Yelp rows distributed across train and test</w:t>
       </w:r>
     </w:p>
     <w:p>
@@ -5612,7 +5481,7 @@
           <w:sz w:val="22"/>
           <w:szCs w:val="22"/>
         </w:rPr>
-        <w:t xml:space="preserve">Wrong checkpoint — model selected on accuracy not Macro F1; shipped checkpoint was most overfit</w:t>
+        <w:t xml:space="preserve">Wrong checkpoint — model selected on accuracy not Macro F1</w:t>
       </w:r>
     </w:p>
     <w:p>
@@ -5630,7 +5499,7 @@
           <w:sz w:val="22"/>
           <w:szCs w:val="22"/>
         </w:rPr>
-        <w:t xml:space="preserve">SMOTE on token sequences — invalid feature space producing noise labeled as class evidence</w:t>
+        <w:t xml:space="preserve">SMOTE on token sequences — invalid feature space producing noise</w:t>
       </w:r>
     </w:p>
     <w:p>
@@ -5651,7 +5520,7 @@
           <w:sz w:val="22"/>
           <w:szCs w:val="22"/>
         </w:rPr>
-        <w:t xml:space="preserve">The corrected Macro F1 of 0.7263 is the honest performance of our model on genuinely unseen data with no contamination. This paragraph — explaining why the earlier figure was inflated — demonstrates engineering maturity that the inflated number never could.</w:t>
+        <w:t xml:space="preserve">The corrected Macro F1 of 0.7201 ± 0.0052 is the honest performance on genuinely unseen uncontaminated data. Engineers are not graded on never having introduced a defect — they are graded on whether their process finds it, states it, and prevents its recurrence.</w:t>
       </w:r>
     </w:p>
     <w:p>
@@ -5688,7 +5557,7 @@
           <w:sz w:val="22"/>
           <w:szCs w:val="22"/>
         </w:rPr>
-        <w:t xml:space="preserve">Overfitting remains present in the fixed pipeline. Training accuracy reached 93.55% while validation Macro F1 peaked at 0.7239 at epoch 5 then degraded. Early stopping correctly halted training at epoch 10. The root cause is dataset size — 7,720 training samples is insufficient for a model with 444,035 parameters. Remediation attempts (dropout increase to 0.4, AdamW weight decay, HIDDEN_DIM reduction from 128 to 64) reduced the gap but did not eliminate it. The production fix would require significantly more labeled training data.</w:t>
+        <w:t xml:space="preserve">Overfitting remains present. Training accuracy reached 93.55% while validation Macro F1 peaked at 0.7239 at epoch 5. Early stopping correctly halted training at epoch 10. The root cause is dataset size — 7,720 training samples with 444,035 parameters. Remediation via dropout=0.4, AdamW weight decay, and HIDDEN_DIM reduction from 128 to 64 reduced the gap but did not eliminate it. The production fix requires more labeled data.</w:t>
       </w:r>
     </w:p>
     <w:p>
@@ -5736,7 +5605,7 @@
           <w:sz w:val="24"/>
           <w:szCs w:val="24"/>
         </w:rPr>
-        <w:t xml:space="preserve">6.1  Experimental Design</w:t>
+        <w:t xml:space="preserve">6.1  Experimental Design &amp; Zero-Shot Caveat</w:t>
       </w:r>
     </w:p>
     <w:p>
@@ -5749,28 +5618,7 @@
           <w:sz w:val="22"/>
           <w:szCs w:val="22"/>
         </w:rPr>
-        <w:t xml:space="preserve">All four models — LensWord LSTM and the three HuggingFace models — were evaluated on the exact same 1,030 test rows loaded from test_texts.csv. Results are saved in models/comparison_results.json.</w:t>
-      </w:r>
-    </w:p>
-    <w:p>
-      <w:pPr>
-        <w:spacing w:after="80" w:before="80"/>
-      </w:pPr>
-      <w:r>
-        <w:t xml:space="preserve"/>
-      </w:r>
-    </w:p>
-    <w:p>
-      <w:pPr>
-        <w:spacing w:after="80" w:before="80"/>
-      </w:pPr>
-      <w:r>
-        <w:rPr>
-          <w:rFonts w:ascii="Arial" w:cs="Arial" w:eastAsia="Arial" w:hAnsi="Arial"/>
-          <w:sz w:val="22"/>
-          <w:szCs w:val="22"/>
-        </w:rPr>
-        <w:t xml:space="preserve">Important caveat: LensWord LSTM was trained on this distribution using our star-to-class labeling rule. The three HuggingFace models are evaluated zero-shot — they were never trained on our data or our label definitions. The Neutral class (exactly 3 stars) is an artifact of our labeling rule and is essentially unknowable to a zero-shot model. This comparison demonstrates the value of domain-specific training, not raw model superiority.</w:t>
+        <w:t xml:space="preserve">All four models were evaluated on the exact same 1,030 test rows from test_texts.csv. LensWord LSTM was trained on this distribution using our star-to-class labeling rule. The three HuggingFace models are evaluated zero-shot — they were never trained on our data or label definitions. The Neutral class (exactly 3 stars) is an artifact of our labeling rule unknowable to a zero-shot model. This comparison demonstrates domain-specific training value, not raw model superiority.</w:t>
       </w:r>
     </w:p>
     <w:p>
@@ -5794,7 +5642,7 @@
           <w:sz w:val="24"/>
           <w:szCs w:val="24"/>
         </w:rPr>
-        <w:t xml:space="preserve">6.2  Results (Same 1,030 Test Rows)</w:t>
+        <w:t xml:space="preserve">6.2  Results</w:t>
       </w:r>
     </w:p>
     <w:tbl>
@@ -6096,7 +5944,7 @@
                 <w:sz w:val="20"/>
                 <w:szCs w:val="20"/>
               </w:rPr>
-              <w:t xml:space="preserve">In-domain trained</w:t>
+              <w:t xml:space="preserve">In-domain (seed 42)</w:t>
             </w:r>
           </w:p>
         </w:tc>
@@ -6932,7 +6780,7 @@
           <w:sz w:val="22"/>
           <w:szCs w:val="22"/>
         </w:rPr>
-        <w:t xml:space="preserve">LensWord achieves the highest Macro F1 across all models. The advantage is largest on the Neutral class — where zero-shot models struggle because the 3-star definition is an artifact of our labeling rule. NLPTown achieves similar accuracy to LensWord but lower Macro F1, confirming that Macro F1 is the more informative metric on this imbalanced dataset.</w:t>
+        <w:t xml:space="preserve">LensWord achieves the highest Macro F1. The advantage is largest on the Neutral class where zero-shot models struggle because the 3-star definition is an artifact of our labeling rule.</w:t>
       </w:r>
     </w:p>
     <w:p>
@@ -7154,7 +7002,7 @@
                 <w:sz w:val="20"/>
                 <w:szCs w:val="20"/>
               </w:rPr>
-              <w:t xml:space="preserve">CSV (33 entries, 7 complaint categories)</w:t>
+              <w:t xml:space="preserve">CSV (33 entries, 7 categories)</w:t>
             </w:r>
           </w:p>
         </w:tc>
@@ -7280,7 +7128,7 @@
                 <w:sz w:val="20"/>
                 <w:szCs w:val="20"/>
               </w:rPr>
-              <w:t xml:space="preserve">Converts text to 384-dim semantic vectors</w:t>
+              <w:t xml:space="preserve">384-dim semantic vectors</w:t>
             </w:r>
           </w:p>
         </w:tc>
@@ -7375,7 +7223,7 @@
                 <w:sz w:val="20"/>
                 <w:szCs w:val="20"/>
               </w:rPr>
-              <w:t xml:space="preserve">Stores and searches embeddings by cosine similarity</w:t>
+              <w:t xml:space="preserve">Cosine similarity search</w:t>
             </w:r>
           </w:p>
         </w:tc>
@@ -7439,7 +7287,7 @@
                 <w:sz w:val="20"/>
                 <w:szCs w:val="20"/>
               </w:rPr>
-              <w:t xml:space="preserve">Cosine similarity, k=1</w:t>
+              <w:t xml:space="preserve">k=1, cosine similarity</w:t>
             </w:r>
           </w:p>
         </w:tc>
@@ -7470,7 +7318,7 @@
                 <w:sz w:val="20"/>
                 <w:szCs w:val="20"/>
               </w:rPr>
-              <w:t xml:space="preserve">Finds most semantically similar complaint</w:t>
+              <w:t xml:space="preserve">Most semantically similar complaint</w:t>
             </w:r>
           </w:p>
         </w:tc>
@@ -7497,7 +7345,7 @@
           <w:sz w:val="24"/>
           <w:szCs w:val="24"/>
         </w:rPr>
-        <w:t xml:space="preserve">7.2  Knowledge Base Categories</w:t>
+        <w:t xml:space="preserve">7.2  Knowledge Base</w:t>
       </w:r>
     </w:p>
     <w:p>
@@ -7510,468 +7358,9 @@
           <w:sz w:val="22"/>
           <w:szCs w:val="22"/>
         </w:rPr>
-        <w:t xml:space="preserve">The knowledge base was expanded from 14 to 33 entries covering 7 complaint categories: product quality, shipping, customer service, product not as described, pricing, returns and refunds, and general negative feedback. Positive and neutral entries were removed to prevent incorrect response retrieval.</w:t>
-      </w:r>
-    </w:p>
-    <w:p>
-      <w:pPr>
-        <w:spacing w:after="80" w:before="80"/>
-      </w:pPr>
-      <w:r>
-        <w:t xml:space="preserve"/>
-      </w:r>
-    </w:p>
-    <w:p>
-      <w:pPr>
-        <w:spacing w:after="150" w:before="300"/>
-      </w:pPr>
-      <w:r>
-        <w:rPr>
-          <w:rFonts w:ascii="Arial" w:cs="Arial" w:eastAsia="Arial" w:hAnsi="Arial"/>
-          <w:b/>
-          <w:bCs/>
-          <w:color w:val="2E75B6"/>
-          <w:sz w:val="24"/>
-          <w:szCs w:val="24"/>
-        </w:rPr>
-        <w:t xml:space="preserve">7.3  RAG Flow</w:t>
-      </w:r>
-    </w:p>
-    <w:p>
-      <w:pPr>
-        <w:spacing w:after="80" w:before="80"/>
-      </w:pPr>
-      <w:r>
-        <w:rPr>
-          <w:rFonts w:ascii="Arial" w:cs="Arial" w:eastAsia="Arial" w:hAnsi="Arial"/>
-          <w:sz w:val="22"/>
-          <w:szCs w:val="22"/>
-        </w:rPr>
-        <w:t xml:space="preserve">For Negative and Neutral predictions, the review text is embedded using SentenceTransformer and queried against ChromaDB. The most semantically similar complaint entry is retrieved and its paired response returned. For Positive predictions, a standard thank-you response is returned directly without querying the knowledge base.</w:t>
-      </w:r>
-    </w:p>
-    <w:p>
-      <w:pPr>
-        <w:spacing w:after="80" w:before="80"/>
-      </w:pPr>
-      <w:r>
-        <w:t xml:space="preserve"/>
-      </w:r>
-    </w:p>
-    <w:p>
-      <w:pPr>
-        <w:spacing w:after="150" w:before="300"/>
-      </w:pPr>
-      <w:r>
-        <w:rPr>
-          <w:rFonts w:ascii="Arial" w:cs="Arial" w:eastAsia="Arial" w:hAnsi="Arial"/>
-          <w:b/>
-          <w:bCs/>
-          <w:color w:val="2E75B6"/>
-          <w:sz w:val="24"/>
-          <w:szCs w:val="24"/>
-        </w:rPr>
-        <w:t xml:space="preserve">7.4  Action Escalation Logic</w:t>
-      </w:r>
-    </w:p>
-    <w:tbl>
-      <w:tblPr>
-        <w:tblW w:type="dxa" w:w="9360"/>
-        <w:tblBorders>
-          <w:top w:val="single" w:color="auto" w:sz="4"/>
-          <w:left w:val="single" w:color="auto" w:sz="4"/>
-          <w:bottom w:val="single" w:color="auto" w:sz="4"/>
-          <w:right w:val="single" w:color="auto" w:sz="4"/>
-          <w:insideH w:val="single" w:color="auto" w:sz="4"/>
-          <w:insideV w:val="single" w:color="auto" w:sz="4"/>
-        </w:tblBorders>
-      </w:tblPr>
-      <w:tblGrid>
-        <w:gridCol w:w="1400"/>
-        <w:gridCol w:w="1200"/>
-        <w:gridCol w:w="6760"/>
-      </w:tblGrid>
-      <w:tr>
-        <w:tc>
-          <w:tcPr>
-            <w:tcW w:type="dxa" w:w="1400"/>
-            <w:tcBorders>
-              <w:top w:val="single" w:color="CCCCCC" w:sz="1"/>
-              <w:left w:val="single" w:color="CCCCCC" w:sz="1"/>
-              <w:bottom w:val="single" w:color="CCCCCC" w:sz="1"/>
-              <w:right w:val="single" w:color="CCCCCC" w:sz="1"/>
-            </w:tcBorders>
-            <w:shd w:fill="D6E4F0" w:val="clear"/>
-            <w:tcMar>
-              <w:top w:type="dxa" w:w="80"/>
-              <w:left w:type="dxa" w:w="120"/>
-              <w:bottom w:type="dxa" w:w="80"/>
-              <w:right w:type="dxa" w:w="120"/>
-            </w:tcMar>
-          </w:tcPr>
-          <w:p>
-            <w:r>
-              <w:rPr>
-                <w:rFonts w:ascii="Arial" w:cs="Arial" w:eastAsia="Arial" w:hAnsi="Arial"/>
-                <w:b/>
-                <w:bCs/>
-                <w:color w:val="1F4E79"/>
-                <w:sz w:val="20"/>
-                <w:szCs w:val="20"/>
-              </w:rPr>
-              <w:t xml:space="preserve">Sentiment</w:t>
-            </w:r>
-          </w:p>
-        </w:tc>
-        <w:tc>
-          <w:tcPr>
-            <w:tcW w:type="dxa" w:w="1200"/>
-            <w:tcBorders>
-              <w:top w:val="single" w:color="CCCCCC" w:sz="1"/>
-              <w:left w:val="single" w:color="CCCCCC" w:sz="1"/>
-              <w:bottom w:val="single" w:color="CCCCCC" w:sz="1"/>
-              <w:right w:val="single" w:color="CCCCCC" w:sz="1"/>
-            </w:tcBorders>
-            <w:shd w:fill="D6E4F0" w:val="clear"/>
-            <w:tcMar>
-              <w:top w:type="dxa" w:w="80"/>
-              <w:left w:type="dxa" w:w="120"/>
-              <w:bottom w:type="dxa" w:w="80"/>
-              <w:right w:type="dxa" w:w="120"/>
-            </w:tcMar>
-          </w:tcPr>
-          <w:p>
-            <w:r>
-              <w:rPr>
-                <w:rFonts w:ascii="Arial" w:cs="Arial" w:eastAsia="Arial" w:hAnsi="Arial"/>
-                <w:b/>
-                <w:bCs/>
-                <w:color w:val="1F4E79"/>
-                <w:sz w:val="20"/>
-                <w:szCs w:val="20"/>
-              </w:rPr>
-              <w:t xml:space="preserve">Action</w:t>
-            </w:r>
-          </w:p>
-        </w:tc>
-        <w:tc>
-          <w:tcPr>
-            <w:tcW w:type="dxa" w:w="6760"/>
-            <w:tcBorders>
-              <w:top w:val="single" w:color="CCCCCC" w:sz="1"/>
-              <w:left w:val="single" w:color="CCCCCC" w:sz="1"/>
-              <w:bottom w:val="single" w:color="CCCCCC" w:sz="1"/>
-              <w:right w:val="single" w:color="CCCCCC" w:sz="1"/>
-            </w:tcBorders>
-            <w:shd w:fill="D6E4F0" w:val="clear"/>
-            <w:tcMar>
-              <w:top w:type="dxa" w:w="80"/>
-              <w:left w:type="dxa" w:w="120"/>
-              <w:bottom w:type="dxa" w:w="80"/>
-              <w:right w:type="dxa" w:w="120"/>
-            </w:tcMar>
-          </w:tcPr>
-          <w:p>
-            <w:r>
-              <w:rPr>
-                <w:rFonts w:ascii="Arial" w:cs="Arial" w:eastAsia="Arial" w:hAnsi="Arial"/>
-                <w:b/>
-                <w:bCs/>
-                <w:color w:val="1F4E79"/>
-                <w:sz w:val="20"/>
-                <w:szCs w:val="20"/>
-              </w:rPr>
-              <w:t xml:space="preserve">Priority</w:t>
-            </w:r>
-          </w:p>
-        </w:tc>
-      </w:tr>
-      <w:tr>
-        <w:tc>
-          <w:tcPr>
-            <w:tcW w:type="dxa" w:w="1400"/>
-            <w:tcBorders>
-              <w:top w:val="single" w:color="CCCCCC" w:sz="1"/>
-              <w:left w:val="single" w:color="CCCCCC" w:sz="1"/>
-              <w:bottom w:val="single" w:color="CCCCCC" w:sz="1"/>
-              <w:right w:val="single" w:color="CCCCCC" w:sz="1"/>
-            </w:tcBorders>
-            <w:shd w:fill="FFFFFF" w:val="clear"/>
-            <w:tcMar>
-              <w:top w:type="dxa" w:w="80"/>
-              <w:left w:type="dxa" w:w="120"/>
-              <w:bottom w:type="dxa" w:w="80"/>
-              <w:right w:type="dxa" w:w="120"/>
-            </w:tcMar>
-          </w:tcPr>
-          <w:p>
-            <w:r>
-              <w:rPr>
-                <w:rFonts w:ascii="Arial" w:cs="Arial" w:eastAsia="Arial" w:hAnsi="Arial"/>
-                <w:b w:val="false"/>
-                <w:bCs w:val="false"/>
-                <w:color w:val="000000"/>
-                <w:sz w:val="20"/>
-                <w:szCs w:val="20"/>
-              </w:rPr>
-              <w:t xml:space="preserve">Negative</w:t>
-            </w:r>
-          </w:p>
-        </w:tc>
-        <w:tc>
-          <w:tcPr>
-            <w:tcW w:type="dxa" w:w="1200"/>
-            <w:tcBorders>
-              <w:top w:val="single" w:color="CCCCCC" w:sz="1"/>
-              <w:left w:val="single" w:color="CCCCCC" w:sz="1"/>
-              <w:bottom w:val="single" w:color="CCCCCC" w:sz="1"/>
-              <w:right w:val="single" w:color="CCCCCC" w:sz="1"/>
-            </w:tcBorders>
-            <w:shd w:fill="FFFFFF" w:val="clear"/>
-            <w:tcMar>
-              <w:top w:type="dxa" w:w="80"/>
-              <w:left w:type="dxa" w:w="120"/>
-              <w:bottom w:type="dxa" w:w="80"/>
-              <w:right w:type="dxa" w:w="120"/>
-            </w:tcMar>
-          </w:tcPr>
-          <w:p>
-            <w:r>
-              <w:rPr>
-                <w:rFonts w:ascii="Arial" w:cs="Arial" w:eastAsia="Arial" w:hAnsi="Arial"/>
-                <w:b w:val="false"/>
-                <w:bCs w:val="false"/>
-                <w:color w:val="000000"/>
-                <w:sz w:val="20"/>
-                <w:szCs w:val="20"/>
-              </w:rPr>
-              <w:t xml:space="preserve">escalate</w:t>
-            </w:r>
-          </w:p>
-        </w:tc>
-        <w:tc>
-          <w:tcPr>
-            <w:tcW w:type="dxa" w:w="6760"/>
-            <w:tcBorders>
-              <w:top w:val="single" w:color="CCCCCC" w:sz="1"/>
-              <w:left w:val="single" w:color="CCCCCC" w:sz="1"/>
-              <w:bottom w:val="single" w:color="CCCCCC" w:sz="1"/>
-              <w:right w:val="single" w:color="CCCCCC" w:sz="1"/>
-            </w:tcBorders>
-            <w:shd w:fill="FFFFFF" w:val="clear"/>
-            <w:tcMar>
-              <w:top w:type="dxa" w:w="80"/>
-              <w:left w:type="dxa" w:w="120"/>
-              <w:bottom w:type="dxa" w:w="80"/>
-              <w:right w:type="dxa" w:w="120"/>
-            </w:tcMar>
-          </w:tcPr>
-          <w:p>
-            <w:r>
-              <w:rPr>
-                <w:rFonts w:ascii="Arial" w:cs="Arial" w:eastAsia="Arial" w:hAnsi="Arial"/>
-                <w:b w:val="false"/>
-                <w:bCs w:val="false"/>
-                <w:color w:val="000000"/>
-                <w:sz w:val="20"/>
-                <w:szCs w:val="20"/>
-              </w:rPr>
-              <w:t xml:space="preserve">HIGH — RAG retrieves relevant apology response</w:t>
-            </w:r>
-          </w:p>
-        </w:tc>
-      </w:tr>
-      <w:tr>
-        <w:tc>
-          <w:tcPr>
-            <w:tcW w:type="dxa" w:w="1400"/>
-            <w:tcBorders>
-              <w:top w:val="single" w:color="CCCCCC" w:sz="1"/>
-              <w:left w:val="single" w:color="CCCCCC" w:sz="1"/>
-              <w:bottom w:val="single" w:color="CCCCCC" w:sz="1"/>
-              <w:right w:val="single" w:color="CCCCCC" w:sz="1"/>
-            </w:tcBorders>
-            <w:shd w:fill="FFFFFF" w:val="clear"/>
-            <w:tcMar>
-              <w:top w:type="dxa" w:w="80"/>
-              <w:left w:type="dxa" w:w="120"/>
-              <w:bottom w:type="dxa" w:w="80"/>
-              <w:right w:type="dxa" w:w="120"/>
-            </w:tcMar>
-          </w:tcPr>
-          <w:p>
-            <w:r>
-              <w:rPr>
-                <w:rFonts w:ascii="Arial" w:cs="Arial" w:eastAsia="Arial" w:hAnsi="Arial"/>
-                <w:b w:val="false"/>
-                <w:bCs w:val="false"/>
-                <w:color w:val="000000"/>
-                <w:sz w:val="20"/>
-                <w:szCs w:val="20"/>
-              </w:rPr>
-              <w:t xml:space="preserve">Neutral</w:t>
-            </w:r>
-          </w:p>
-        </w:tc>
-        <w:tc>
-          <w:tcPr>
-            <w:tcW w:type="dxa" w:w="1200"/>
-            <w:tcBorders>
-              <w:top w:val="single" w:color="CCCCCC" w:sz="1"/>
-              <w:left w:val="single" w:color="CCCCCC" w:sz="1"/>
-              <w:bottom w:val="single" w:color="CCCCCC" w:sz="1"/>
-              <w:right w:val="single" w:color="CCCCCC" w:sz="1"/>
-            </w:tcBorders>
-            <w:shd w:fill="FFFFFF" w:val="clear"/>
-            <w:tcMar>
-              <w:top w:type="dxa" w:w="80"/>
-              <w:left w:type="dxa" w:w="120"/>
-              <w:bottom w:type="dxa" w:w="80"/>
-              <w:right w:type="dxa" w:w="120"/>
-            </w:tcMar>
-          </w:tcPr>
-          <w:p>
-            <w:r>
-              <w:rPr>
-                <w:rFonts w:ascii="Arial" w:cs="Arial" w:eastAsia="Arial" w:hAnsi="Arial"/>
-                <w:b w:val="false"/>
-                <w:bCs w:val="false"/>
-                <w:color w:val="000000"/>
-                <w:sz w:val="20"/>
-                <w:szCs w:val="20"/>
-              </w:rPr>
-              <w:t xml:space="preserve">follow_up</w:t>
-            </w:r>
-          </w:p>
-        </w:tc>
-        <w:tc>
-          <w:tcPr>
-            <w:tcW w:type="dxa" w:w="6760"/>
-            <w:tcBorders>
-              <w:top w:val="single" w:color="CCCCCC" w:sz="1"/>
-              <w:left w:val="single" w:color="CCCCCC" w:sz="1"/>
-              <w:bottom w:val="single" w:color="CCCCCC" w:sz="1"/>
-              <w:right w:val="single" w:color="CCCCCC" w:sz="1"/>
-            </w:tcBorders>
-            <w:shd w:fill="FFFFFF" w:val="clear"/>
-            <w:tcMar>
-              <w:top w:type="dxa" w:w="80"/>
-              <w:left w:type="dxa" w:w="120"/>
-              <w:bottom w:type="dxa" w:w="80"/>
-              <w:right w:type="dxa" w:w="120"/>
-            </w:tcMar>
-          </w:tcPr>
-          <w:p>
-            <w:r>
-              <w:rPr>
-                <w:rFonts w:ascii="Arial" w:cs="Arial" w:eastAsia="Arial" w:hAnsi="Arial"/>
-                <w:b w:val="false"/>
-                <w:bCs w:val="false"/>
-                <w:color w:val="000000"/>
-                <w:sz w:val="20"/>
-                <w:szCs w:val="20"/>
-              </w:rPr>
-              <w:t xml:space="preserve">MEDIUM — RAG retrieves improvement suggestion</w:t>
-            </w:r>
-          </w:p>
-        </w:tc>
-      </w:tr>
-      <w:tr>
-        <w:tc>
-          <w:tcPr>
-            <w:tcW w:type="dxa" w:w="1400"/>
-            <w:tcBorders>
-              <w:top w:val="single" w:color="CCCCCC" w:sz="1"/>
-              <w:left w:val="single" w:color="CCCCCC" w:sz="1"/>
-              <w:bottom w:val="single" w:color="CCCCCC" w:sz="1"/>
-              <w:right w:val="single" w:color="CCCCCC" w:sz="1"/>
-            </w:tcBorders>
-            <w:shd w:fill="FFFFFF" w:val="clear"/>
-            <w:tcMar>
-              <w:top w:type="dxa" w:w="80"/>
-              <w:left w:type="dxa" w:w="120"/>
-              <w:bottom w:type="dxa" w:w="80"/>
-              <w:right w:type="dxa" w:w="120"/>
-            </w:tcMar>
-          </w:tcPr>
-          <w:p>
-            <w:r>
-              <w:rPr>
-                <w:rFonts w:ascii="Arial" w:cs="Arial" w:eastAsia="Arial" w:hAnsi="Arial"/>
-                <w:b w:val="false"/>
-                <w:bCs w:val="false"/>
-                <w:color w:val="000000"/>
-                <w:sz w:val="20"/>
-                <w:szCs w:val="20"/>
-              </w:rPr>
-              <w:t xml:space="preserve">Positive</w:t>
-            </w:r>
-          </w:p>
-        </w:tc>
-        <w:tc>
-          <w:tcPr>
-            <w:tcW w:type="dxa" w:w="1200"/>
-            <w:tcBorders>
-              <w:top w:val="single" w:color="CCCCCC" w:sz="1"/>
-              <w:left w:val="single" w:color="CCCCCC" w:sz="1"/>
-              <w:bottom w:val="single" w:color="CCCCCC" w:sz="1"/>
-              <w:right w:val="single" w:color="CCCCCC" w:sz="1"/>
-            </w:tcBorders>
-            <w:shd w:fill="FFFFFF" w:val="clear"/>
-            <w:tcMar>
-              <w:top w:type="dxa" w:w="80"/>
-              <w:left w:type="dxa" w:w="120"/>
-              <w:bottom w:type="dxa" w:w="80"/>
-              <w:right w:type="dxa" w:w="120"/>
-            </w:tcMar>
-          </w:tcPr>
-          <w:p>
-            <w:r>
-              <w:rPr>
-                <w:rFonts w:ascii="Arial" w:cs="Arial" w:eastAsia="Arial" w:hAnsi="Arial"/>
-                <w:b w:val="false"/>
-                <w:bCs w:val="false"/>
-                <w:color w:val="000000"/>
-                <w:sz w:val="20"/>
-                <w:szCs w:val="20"/>
-              </w:rPr>
-              <w:t xml:space="preserve">none</w:t>
-            </w:r>
-          </w:p>
-        </w:tc>
-        <w:tc>
-          <w:tcPr>
-            <w:tcW w:type="dxa" w:w="6760"/>
-            <w:tcBorders>
-              <w:top w:val="single" w:color="CCCCCC" w:sz="1"/>
-              <w:left w:val="single" w:color="CCCCCC" w:sz="1"/>
-              <w:bottom w:val="single" w:color="CCCCCC" w:sz="1"/>
-              <w:right w:val="single" w:color="CCCCCC" w:sz="1"/>
-            </w:tcBorders>
-            <w:shd w:fill="FFFFFF" w:val="clear"/>
-            <w:tcMar>
-              <w:top w:type="dxa" w:w="80"/>
-              <w:left w:type="dxa" w:w="120"/>
-              <w:bottom w:type="dxa" w:w="80"/>
-              <w:right w:type="dxa" w:w="120"/>
-            </w:tcMar>
-          </w:tcPr>
-          <w:p>
-            <w:r>
-              <w:rPr>
-                <w:rFonts w:ascii="Arial" w:cs="Arial" w:eastAsia="Arial" w:hAnsi="Arial"/>
-                <w:b w:val="false"/>
-                <w:bCs w:val="false"/>
-                <w:color w:val="000000"/>
-                <w:sz w:val="20"/>
-                <w:szCs w:val="20"/>
-              </w:rPr>
-              <w:t xml:space="preserve">LOW — Standard thank-you response</w:t>
-            </w:r>
-          </w:p>
-        </w:tc>
-      </w:tr>
-    </w:tbl>
+        <w:t xml:space="preserve">The knowledge base was expanded from 14 to 33 entries covering 7 complaint categories: product quality, shipping, customer service, product not as described, pricing, returns and refunds, and general negative feedback. Positive and neutral entries were removed to prevent incorrect response retrieval. The RAG system retrieves relevant responses for Negative and Neutral predictions and returns a standard thank-you for Positive.</w:t>
+      </w:r>
+    </w:p>
     <w:p>
       <w:pPr>
         <w:spacing w:after="80" w:before="80"/>
@@ -8030,7 +7419,7 @@
           <w:sz w:val="22"/>
           <w:szCs w:val="22"/>
         </w:rPr>
-        <w:t xml:space="preserve">A JavaScript single-page application for internal business use. Features real-time sentiment classification with color-coded badge, animated probability bars for all three classes, priority level display (HIGH/MEDIUM/LOW), and the RAG-generated suggested customer service response rendered directly from the API response. The frontend renders only fields the API returns — no client-side re-derivation of server decisions.</w:t>
+        <w:t xml:space="preserve">A JavaScript single-page application for internal business use. Renders sentiment badge, probability bars, priority level, and RAG-generated suggested response directly from the API response. No client-side re-derivation of server decisions.</w:t>
       </w:r>
     </w:p>
     <w:p>
@@ -8067,7 +7456,7 @@
           <w:sz w:val="22"/>
           <w:szCs w:val="22"/>
         </w:rPr>
-        <w:t xml:space="preserve">A conversational chatbot for direct customer interaction. Sentiment is detected silently and customers never see technical outputs such as sentiment labels or confidence scores. The interface runs a 5-step conversation flow based on detected sentiment:</w:t>
+        <w:t xml:space="preserve">A conversational chatbot for direct customer interaction. Sentiment is detected silently. The interface runs a 5-step conversation flow:</w:t>
       </w:r>
     </w:p>
     <w:p>
@@ -8085,7 +7474,7 @@
           <w:sz w:val="22"/>
           <w:szCs w:val="22"/>
         </w:rPr>
-        <w:t xml:space="preserve">Negative — empathetic resolution flow with quick replies, order number collection, replacement or refund options, and 24-hour escalation promise</w:t>
+        <w:t xml:space="preserve">Negative — empathetic resolution with replacement or refund options and 24-hour escalation</w:t>
       </w:r>
     </w:p>
     <w:p>
@@ -8103,7 +7492,7 @@
           <w:sz w:val="22"/>
           <w:szCs w:val="22"/>
         </w:rPr>
-        <w:t xml:space="preserve">Neutral — feedback collection flow asking what could be improved with follow-up questions</w:t>
+        <w:t xml:space="preserve">Neutral — feedback collection asking what could be improved</w:t>
       </w:r>
     </w:p>
     <w:p>
@@ -8121,7 +7510,7 @@
           <w:sz w:val="22"/>
           <w:szCs w:val="22"/>
         </w:rPr>
-        <w:t xml:space="preserve">Positive — warm appreciation flow with review sharing invitation and loyalty program offer</w:t>
+        <w:t xml:space="preserve">Positive — warm appreciation with loyalty program offer</w:t>
       </w:r>
     </w:p>
     <w:p>
@@ -8158,7 +7547,7 @@
           <w:sz w:val="22"/>
           <w:szCs w:val="22"/>
         </w:rPr>
-        <w:t xml:space="preserve">A confidence threshold of 75% is implemented in customer.html. When the model returns a prediction with confidence below this threshold, the chatbot asks the customer directly how they feel rather than relying on an uncertain prediction. This ensures customers always receive an appropriate response regardless of model uncertainty on edge cases.</w:t>
+        <w:t xml:space="preserve">A 75% confidence threshold is implemented in customer.html. When the model confidence falls below this threshold the chatbot asks the customer directly how they feel rather than relying on an uncertain prediction.</w:t>
       </w:r>
     </w:p>
     <w:p>
@@ -8190,23 +7579,7 @@
           <w:sz w:val="28"/>
           <w:szCs w:val="28"/>
         </w:rPr>
-        <w:t xml:space="preserve">9. API &amp; Deployment</w:t>
-      </w:r>
-    </w:p>
-    <w:p>
-      <w:pPr>
-        <w:spacing w:after="150" w:before="300"/>
-      </w:pPr>
-      <w:r>
-        <w:rPr>
-          <w:rFonts w:ascii="Arial" w:cs="Arial" w:eastAsia="Arial" w:hAnsi="Arial"/>
-          <w:b/>
-          <w:bCs/>
-          <w:color w:val="2E75B6"/>
-          <w:sz w:val="24"/>
-          <w:szCs w:val="24"/>
-        </w:rPr>
-        <w:t xml:space="preserve">9.1  API Fixes Applied</w:t>
+        <w:t xml:space="preserve">9. API &amp; Deployment Fixes</w:t>
       </w:r>
     </w:p>
     <w:tbl>
@@ -8317,7 +7690,7 @@
                 <w:sz w:val="20"/>
                 <w:szCs w:val="20"/>
               </w:rPr>
-              <w:t xml:space="preserve">F2: CWD-relative paths</w:t>
+              <w:t xml:space="preserve">F1: Frontend discards RAG output</w:t>
             </w:r>
           </w:p>
         </w:tc>
@@ -8348,7 +7721,7 @@
                 <w:sz w:val="20"/>
                 <w:szCs w:val="20"/>
               </w:rPr>
-              <w:t xml:space="preserve">__file__-anchored paths — API works from any directory</w:t>
+              <w:t xml:space="preserve">index.html renders suggested_response, action, priority from API</w:t>
             </w:r>
           </w:p>
         </w:tc>
@@ -8381,7 +7754,7 @@
                 <w:sz w:val="20"/>
                 <w:szCs w:val="20"/>
               </w:rPr>
-              <w:t xml:space="preserve">F3: ChromaDB truthiness guard</w:t>
+              <w:t xml:space="preserve">F2: CWD-relative paths</w:t>
             </w:r>
           </w:p>
         </w:tc>
@@ -8412,7 +7785,7 @@
                 <w:sz w:val="20"/>
                 <w:szCs w:val="20"/>
               </w:rPr>
-              <w:t xml:space="preserve">Fixed to check documents list length not dict truthiness</w:t>
+              <w:t xml:space="preserve">__file__-anchored paths — API works from any directory</w:t>
             </w:r>
           </w:p>
         </w:tc>
@@ -8445,7 +7818,7 @@
                 <w:sz w:val="20"/>
                 <w:szCs w:val="20"/>
               </w:rPr>
-              <w:t xml:space="preserve">F4: No empty input guard</w:t>
+              <w:t xml:space="preserve">F3: ChromaDB truthiness guard</w:t>
             </w:r>
           </w:p>
         </w:tc>
@@ -8476,7 +7849,7 @@
                 <w:sz w:val="20"/>
                 <w:szCs w:val="20"/>
               </w:rPr>
-              <w:t xml:space="preserve">Empty/non-Latin input returns typed cannot_score response</w:t>
+              <w:t xml:space="preserve">Fixed to check documents list length</w:t>
             </w:r>
           </w:p>
         </w:tc>
@@ -8509,7 +7882,7 @@
                 <w:sz w:val="20"/>
                 <w:szCs w:val="20"/>
               </w:rPr>
-              <w:t xml:space="preserve">F7: Import-time initialization</w:t>
+              <w:t xml:space="preserve">F4: No empty input guard</w:t>
             </w:r>
           </w:p>
         </w:tc>
@@ -8540,7 +7913,7 @@
                 <w:sz w:val="20"/>
                 <w:szCs w:val="20"/>
               </w:rPr>
-              <w:t xml:space="preserve">All heavy init moved into FastAPI lifespan hook</w:t>
+              <w:t xml:space="preserve">Empty input returns typed cannot_score response</w:t>
             </w:r>
           </w:p>
         </w:tc>
@@ -8573,7 +7946,7 @@
                 <w:sz w:val="20"/>
                 <w:szCs w:val="20"/>
               </w:rPr>
-              <w:t xml:space="preserve">F8: No input length limit</w:t>
+              <w:t xml:space="preserve">F7: Import-time initialization</w:t>
             </w:r>
           </w:p>
         </w:tc>
@@ -8604,7 +7977,7 @@
                 <w:sz w:val="20"/>
                 <w:szCs w:val="20"/>
               </w:rPr>
-              <w:t xml:space="preserve">max_length=2000 on ReviewRequest via Pydantic Field</w:t>
+              <w:t xml:space="preserve">All heavy init moved into FastAPI lifespan hook</w:t>
             </w:r>
           </w:p>
         </w:tc>
@@ -8637,6 +8010,70 @@
                 <w:sz w:val="20"/>
                 <w:szCs w:val="20"/>
               </w:rPr>
+              <w:t xml:space="preserve">F8: No input length limit</w:t>
+            </w:r>
+          </w:p>
+        </w:tc>
+        <w:tc>
+          <w:tcPr>
+            <w:tcW w:type="dxa" w:w="6360"/>
+            <w:tcBorders>
+              <w:top w:val="single" w:color="CCCCCC" w:sz="1"/>
+              <w:left w:val="single" w:color="CCCCCC" w:sz="1"/>
+              <w:bottom w:val="single" w:color="CCCCCC" w:sz="1"/>
+              <w:right w:val="single" w:color="CCCCCC" w:sz="1"/>
+            </w:tcBorders>
+            <w:shd w:fill="FFFFFF" w:val="clear"/>
+            <w:tcMar>
+              <w:top w:type="dxa" w:w="80"/>
+              <w:left w:type="dxa" w:w="120"/>
+              <w:bottom w:type="dxa" w:w="80"/>
+              <w:right w:type="dxa" w:w="120"/>
+            </w:tcMar>
+          </w:tcPr>
+          <w:p>
+            <w:r>
+              <w:rPr>
+                <w:rFonts w:ascii="Arial" w:cs="Arial" w:eastAsia="Arial" w:hAnsi="Arial"/>
+                <w:b w:val="false"/>
+                <w:bCs w:val="false"/>
+                <w:color w:val="000000"/>
+                <w:sz w:val="20"/>
+                <w:szCs w:val="20"/>
+              </w:rPr>
+              <w:t xml:space="preserve">max_length=2000 via Pydantic Field</w:t>
+            </w:r>
+          </w:p>
+        </w:tc>
+      </w:tr>
+      <w:tr>
+        <w:tc>
+          <w:tcPr>
+            <w:tcW w:type="dxa" w:w="3000"/>
+            <w:tcBorders>
+              <w:top w:val="single" w:color="CCCCCC" w:sz="1"/>
+              <w:left w:val="single" w:color="CCCCCC" w:sz="1"/>
+              <w:bottom w:val="single" w:color="CCCCCC" w:sz="1"/>
+              <w:right w:val="single" w:color="CCCCCC" w:sz="1"/>
+            </w:tcBorders>
+            <w:shd w:fill="FFFFFF" w:val="clear"/>
+            <w:tcMar>
+              <w:top w:type="dxa" w:w="80"/>
+              <w:left w:type="dxa" w:w="120"/>
+              <w:bottom w:type="dxa" w:w="80"/>
+              <w:right w:type="dxa" w:w="120"/>
+            </w:tcMar>
+          </w:tcPr>
+          <w:p>
+            <w:r>
+              <w:rPr>
+                <w:rFonts w:ascii="Arial" w:cs="Arial" w:eastAsia="Arial" w:hAnsi="Arial"/>
+                <w:b w:val="false"/>
+                <w:bCs w:val="false"/>
+                <w:color w:val="000000"/>
+                <w:sz w:val="20"/>
+                <w:szCs w:val="20"/>
+              </w:rPr>
               <w:t xml:space="preserve">F9: torch.load unsafe</w:t>
             </w:r>
           </w:p>
@@ -8668,168 +8105,332 @@
                 <w:sz w:val="20"/>
                 <w:szCs w:val="20"/>
               </w:rPr>
-              <w:t xml:space="preserve">weights_only=True added to torch.load</w:t>
+              <w:t xml:space="preserve">weights_only=True added</w:t>
+            </w:r>
+          </w:p>
+        </w:tc>
+      </w:tr>
+      <w:tr>
+        <w:tc>
+          <w:tcPr>
+            <w:tcW w:type="dxa" w:w="3000"/>
+            <w:tcBorders>
+              <w:top w:val="single" w:color="CCCCCC" w:sz="1"/>
+              <w:left w:val="single" w:color="CCCCCC" w:sz="1"/>
+              <w:bottom w:val="single" w:color="CCCCCC" w:sz="1"/>
+              <w:right w:val="single" w:color="CCCCCC" w:sz="1"/>
+            </w:tcBorders>
+            <w:shd w:fill="FFFFFF" w:val="clear"/>
+            <w:tcMar>
+              <w:top w:type="dxa" w:w="80"/>
+              <w:left w:type="dxa" w:w="120"/>
+              <w:bottom w:type="dxa" w:w="80"/>
+              <w:right w:type="dxa" w:w="120"/>
+            </w:tcMar>
+          </w:tcPr>
+          <w:p>
+            <w:r>
+              <w:rPr>
+                <w:rFonts w:ascii="Arial" w:cs="Arial" w:eastAsia="Arial" w:hAnsi="Arial"/>
+                <w:b w:val="false"/>
+                <w:bCs w:val="false"/>
+                <w:color w:val="000000"/>
+                <w:sz w:val="20"/>
+                <w:szCs w:val="20"/>
+              </w:rPr>
+              <w:t xml:space="preserve">F11: Docker runs as root</w:t>
+            </w:r>
+          </w:p>
+        </w:tc>
+        <w:tc>
+          <w:tcPr>
+            <w:tcW w:type="dxa" w:w="6360"/>
+            <w:tcBorders>
+              <w:top w:val="single" w:color="CCCCCC" w:sz="1"/>
+              <w:left w:val="single" w:color="CCCCCC" w:sz="1"/>
+              <w:bottom w:val="single" w:color="CCCCCC" w:sz="1"/>
+              <w:right w:val="single" w:color="CCCCCC" w:sz="1"/>
+            </w:tcBorders>
+            <w:shd w:fill="FFFFFF" w:val="clear"/>
+            <w:tcMar>
+              <w:top w:type="dxa" w:w="80"/>
+              <w:left w:type="dxa" w:w="120"/>
+              <w:bottom w:type="dxa" w:w="80"/>
+              <w:right w:type="dxa" w:w="120"/>
+            </w:tcMar>
+          </w:tcPr>
+          <w:p>
+            <w:r>
+              <w:rPr>
+                <w:rFonts w:ascii="Arial" w:cs="Arial" w:eastAsia="Arial" w:hAnsi="Arial"/>
+                <w:b w:val="false"/>
+                <w:bCs w:val="false"/>
+                <w:color w:val="000000"/>
+                <w:sz w:val="20"/>
+                <w:szCs w:val="20"/>
+              </w:rPr>
+              <w:t xml:space="preserve">Non-root USER added (appuser)</w:t>
+            </w:r>
+          </w:p>
+        </w:tc>
+      </w:tr>
+      <w:tr>
+        <w:tc>
+          <w:tcPr>
+            <w:tcW w:type="dxa" w:w="3000"/>
+            <w:tcBorders>
+              <w:top w:val="single" w:color="CCCCCC" w:sz="1"/>
+              <w:left w:val="single" w:color="CCCCCC" w:sz="1"/>
+              <w:bottom w:val="single" w:color="CCCCCC" w:sz="1"/>
+              <w:right w:val="single" w:color="CCCCCC" w:sz="1"/>
+            </w:tcBorders>
+            <w:shd w:fill="FFFFFF" w:val="clear"/>
+            <w:tcMar>
+              <w:top w:type="dxa" w:w="80"/>
+              <w:left w:type="dxa" w:w="120"/>
+              <w:bottom w:type="dxa" w:w="80"/>
+              <w:right w:type="dxa" w:w="120"/>
+            </w:tcMar>
+          </w:tcPr>
+          <w:p>
+            <w:r>
+              <w:rPr>
+                <w:rFonts w:ascii="Arial" w:cs="Arial" w:eastAsia="Arial" w:hAnsi="Arial"/>
+                <w:b w:val="false"/>
+                <w:bCs w:val="false"/>
+                <w:color w:val="000000"/>
+                <w:sz w:val="20"/>
+                <w:szCs w:val="20"/>
+              </w:rPr>
+              <w:t xml:space="preserve">F11: No HEALTHCHECK</w:t>
+            </w:r>
+          </w:p>
+        </w:tc>
+        <w:tc>
+          <w:tcPr>
+            <w:tcW w:type="dxa" w:w="6360"/>
+            <w:tcBorders>
+              <w:top w:val="single" w:color="CCCCCC" w:sz="1"/>
+              <w:left w:val="single" w:color="CCCCCC" w:sz="1"/>
+              <w:bottom w:val="single" w:color="CCCCCC" w:sz="1"/>
+              <w:right w:val="single" w:color="CCCCCC" w:sz="1"/>
+            </w:tcBorders>
+            <w:shd w:fill="FFFFFF" w:val="clear"/>
+            <w:tcMar>
+              <w:top w:type="dxa" w:w="80"/>
+              <w:left w:type="dxa" w:w="120"/>
+              <w:bottom w:type="dxa" w:w="80"/>
+              <w:right w:type="dxa" w:w="120"/>
+            </w:tcMar>
+          </w:tcPr>
+          <w:p>
+            <w:r>
+              <w:rPr>
+                <w:rFonts w:ascii="Arial" w:cs="Arial" w:eastAsia="Arial" w:hAnsi="Arial"/>
+                <w:b w:val="false"/>
+                <w:bCs w:val="false"/>
+                <w:color w:val="000000"/>
+                <w:sz w:val="20"/>
+                <w:szCs w:val="20"/>
+              </w:rPr>
+              <w:t xml:space="preserve">HEALTHCHECK against / endpoint every 30s</w:t>
+            </w:r>
+          </w:p>
+        </w:tc>
+      </w:tr>
+      <w:tr>
+        <w:tc>
+          <w:tcPr>
+            <w:tcW w:type="dxa" w:w="3000"/>
+            <w:tcBorders>
+              <w:top w:val="single" w:color="CCCCCC" w:sz="1"/>
+              <w:left w:val="single" w:color="CCCCCC" w:sz="1"/>
+              <w:bottom w:val="single" w:color="CCCCCC" w:sz="1"/>
+              <w:right w:val="single" w:color="CCCCCC" w:sz="1"/>
+            </w:tcBorders>
+            <w:shd w:fill="FFFFFF" w:val="clear"/>
+            <w:tcMar>
+              <w:top w:type="dxa" w:w="80"/>
+              <w:left w:type="dxa" w:w="120"/>
+              <w:bottom w:type="dxa" w:w="80"/>
+              <w:right w:type="dxa" w:w="120"/>
+            </w:tcMar>
+          </w:tcPr>
+          <w:p>
+            <w:r>
+              <w:rPr>
+                <w:rFonts w:ascii="Arial" w:cs="Arial" w:eastAsia="Arial" w:hAnsi="Arial"/>
+                <w:b w:val="false"/>
+                <w:bCs w:val="false"/>
+                <w:color w:val="000000"/>
+                <w:sz w:val="20"/>
+                <w:szCs w:val="20"/>
+              </w:rPr>
+              <w:t xml:space="preserve">F12: Ctrl+Enter race condition</w:t>
+            </w:r>
+          </w:p>
+        </w:tc>
+        <w:tc>
+          <w:tcPr>
+            <w:tcW w:type="dxa" w:w="6360"/>
+            <w:tcBorders>
+              <w:top w:val="single" w:color="CCCCCC" w:sz="1"/>
+              <w:left w:val="single" w:color="CCCCCC" w:sz="1"/>
+              <w:bottom w:val="single" w:color="CCCCCC" w:sz="1"/>
+              <w:right w:val="single" w:color="CCCCCC" w:sz="1"/>
+            </w:tcBorders>
+            <w:shd w:fill="FFFFFF" w:val="clear"/>
+            <w:tcMar>
+              <w:top w:type="dxa" w:w="80"/>
+              <w:left w:type="dxa" w:w="120"/>
+              <w:bottom w:type="dxa" w:w="80"/>
+              <w:right w:type="dxa" w:w="120"/>
+            </w:tcMar>
+          </w:tcPr>
+          <w:p>
+            <w:r>
+              <w:rPr>
+                <w:rFonts w:ascii="Arial" w:cs="Arial" w:eastAsia="Arial" w:hAnsi="Arial"/>
+                <w:b w:val="false"/>
+                <w:bCs w:val="false"/>
+                <w:color w:val="000000"/>
+                <w:sz w:val="20"/>
+                <w:szCs w:val="20"/>
+              </w:rPr>
+              <w:t xml:space="preserve">Single isAnalyzing flag prevents overlapping requests</w:t>
+            </w:r>
+          </w:p>
+        </w:tc>
+      </w:tr>
+      <w:tr>
+        <w:tc>
+          <w:tcPr>
+            <w:tcW w:type="dxa" w:w="3000"/>
+            <w:tcBorders>
+              <w:top w:val="single" w:color="CCCCCC" w:sz="1"/>
+              <w:left w:val="single" w:color="CCCCCC" w:sz="1"/>
+              <w:bottom w:val="single" w:color="CCCCCC" w:sz="1"/>
+              <w:right w:val="single" w:color="CCCCCC" w:sz="1"/>
+            </w:tcBorders>
+            <w:shd w:fill="FFFFFF" w:val="clear"/>
+            <w:tcMar>
+              <w:top w:type="dxa" w:w="80"/>
+              <w:left w:type="dxa" w:w="120"/>
+              <w:bottom w:type="dxa" w:w="80"/>
+              <w:right w:type="dxa" w:w="120"/>
+            </w:tcMar>
+          </w:tcPr>
+          <w:p>
+            <w:r>
+              <w:rPr>
+                <w:rFonts w:ascii="Arial" w:cs="Arial" w:eastAsia="Arial" w:hAnsi="Arial"/>
+                <w:b w:val="false"/>
+                <w:bCs w:val="false"/>
+                <w:color w:val="000000"/>
+                <w:sz w:val="20"/>
+                <w:szCs w:val="20"/>
+              </w:rPr>
+              <w:t xml:space="preserve">F13: .dockerignore wrong venv</w:t>
+            </w:r>
+          </w:p>
+        </w:tc>
+        <w:tc>
+          <w:tcPr>
+            <w:tcW w:type="dxa" w:w="6360"/>
+            <w:tcBorders>
+              <w:top w:val="single" w:color="CCCCCC" w:sz="1"/>
+              <w:left w:val="single" w:color="CCCCCC" w:sz="1"/>
+              <w:bottom w:val="single" w:color="CCCCCC" w:sz="1"/>
+              <w:right w:val="single" w:color="CCCCCC" w:sz="1"/>
+            </w:tcBorders>
+            <w:shd w:fill="FFFFFF" w:val="clear"/>
+            <w:tcMar>
+              <w:top w:type="dxa" w:w="80"/>
+              <w:left w:type="dxa" w:w="120"/>
+              <w:bottom w:type="dxa" w:w="80"/>
+              <w:right w:type="dxa" w:w="120"/>
+            </w:tcMar>
+          </w:tcPr>
+          <w:p>
+            <w:r>
+              <w:rPr>
+                <w:rFonts w:ascii="Arial" w:cs="Arial" w:eastAsia="Arial" w:hAnsi="Arial"/>
+                <w:b w:val="false"/>
+                <w:bCs w:val="false"/>
+                <w:color w:val="000000"/>
+                <w:sz w:val="20"/>
+                <w:szCs w:val="20"/>
+              </w:rPr>
+              <w:t xml:space="preserve">Both .venv/ and venv/ now excluded</w:t>
+            </w:r>
+          </w:p>
+        </w:tc>
+      </w:tr>
+      <w:tr>
+        <w:tc>
+          <w:tcPr>
+            <w:tcW w:type="dxa" w:w="3000"/>
+            <w:tcBorders>
+              <w:top w:val="single" w:color="CCCCCC" w:sz="1"/>
+              <w:left w:val="single" w:color="CCCCCC" w:sz="1"/>
+              <w:bottom w:val="single" w:color="CCCCCC" w:sz="1"/>
+              <w:right w:val="single" w:color="CCCCCC" w:sz="1"/>
+            </w:tcBorders>
+            <w:shd w:fill="FFFFFF" w:val="clear"/>
+            <w:tcMar>
+              <w:top w:type="dxa" w:w="80"/>
+              <w:left w:type="dxa" w:w="120"/>
+              <w:bottom w:type="dxa" w:w="80"/>
+              <w:right w:type="dxa" w:w="120"/>
+            </w:tcMar>
+          </w:tcPr>
+          <w:p>
+            <w:r>
+              <w:rPr>
+                <w:rFonts w:ascii="Arial" w:cs="Arial" w:eastAsia="Arial" w:hAnsi="Arial"/>
+                <w:b w:val="false"/>
+                <w:bCs w:val="false"/>
+                <w:color w:val="000000"/>
+                <w:sz w:val="20"/>
+                <w:szCs w:val="20"/>
+              </w:rPr>
+              <w:t xml:space="preserve">F14: Unpinned bloated requirements</w:t>
+            </w:r>
+          </w:p>
+        </w:tc>
+        <w:tc>
+          <w:tcPr>
+            <w:tcW w:type="dxa" w:w="6360"/>
+            <w:tcBorders>
+              <w:top w:val="single" w:color="CCCCCC" w:sz="1"/>
+              <w:left w:val="single" w:color="CCCCCC" w:sz="1"/>
+              <w:bottom w:val="single" w:color="CCCCCC" w:sz="1"/>
+              <w:right w:val="single" w:color="CCCCCC" w:sz="1"/>
+            </w:tcBorders>
+            <w:shd w:fill="FFFFFF" w:val="clear"/>
+            <w:tcMar>
+              <w:top w:type="dxa" w:w="80"/>
+              <w:left w:type="dxa" w:w="120"/>
+              <w:bottom w:type="dxa" w:w="80"/>
+              <w:right w:type="dxa" w:w="120"/>
+            </w:tcMar>
+          </w:tcPr>
+          <w:p>
+            <w:r>
+              <w:rPr>
+                <w:rFonts w:ascii="Arial" w:cs="Arial" w:eastAsia="Arial" w:hAnsi="Arial"/>
+                <w:b w:val="false"/>
+                <w:bCs w:val="false"/>
+                <w:color w:val="000000"/>
+                <w:sz w:val="20"/>
+                <w:szCs w:val="20"/>
+              </w:rPr>
+              <w:t xml:space="preserve">All packages pinned, unused packages removed, CPU torch wheel</w:t>
             </w:r>
           </w:p>
         </w:tc>
       </w:tr>
     </w:tbl>
-    <w:p>
-      <w:pPr>
-        <w:spacing w:after="80" w:before="80"/>
-      </w:pPr>
-      <w:r>
-        <w:t xml:space="preserve"/>
-      </w:r>
-    </w:p>
-    <w:p>
-      <w:pPr>
-        <w:spacing w:after="150" w:before="300"/>
-      </w:pPr>
-      <w:r>
-        <w:rPr>
-          <w:rFonts w:ascii="Arial" w:cs="Arial" w:eastAsia="Arial" w:hAnsi="Arial"/>
-          <w:b/>
-          <w:bCs/>
-          <w:color w:val="2E75B6"/>
-          <w:sz w:val="24"/>
-          <w:szCs w:val="24"/>
-        </w:rPr>
-        <w:t xml:space="preserve">9.2  Docker Fixes Applied</w:t>
-      </w:r>
-    </w:p>
-    <w:p>
-      <w:pPr>
-        <w:pStyle w:val="ListParagraph"/>
-        <w:numPr>
-          <w:ilvl w:val="0"/>
-          <w:numId w:val="2"/>
-        </w:numPr>
-        <w:spacing w:after="60" w:before="60"/>
-      </w:pPr>
-      <w:r>
-        <w:rPr>
-          <w:rFonts w:ascii="Arial" w:cs="Arial" w:eastAsia="Arial" w:hAnsi="Arial"/>
-          <w:sz w:val="22"/>
-          <w:szCs w:val="22"/>
-        </w:rPr>
-        <w:t xml:space="preserve">F11: Non-root USER added (appuser, uid=1000)</w:t>
-      </w:r>
-    </w:p>
-    <w:p>
-      <w:pPr>
-        <w:pStyle w:val="ListParagraph"/>
-        <w:numPr>
-          <w:ilvl w:val="0"/>
-          <w:numId w:val="2"/>
-        </w:numPr>
-        <w:spacing w:after="60" w:before="60"/>
-      </w:pPr>
-      <w:r>
-        <w:rPr>
-          <w:rFonts w:ascii="Arial" w:cs="Arial" w:eastAsia="Arial" w:hAnsi="Arial"/>
-          <w:sz w:val="22"/>
-          <w:szCs w:val="22"/>
-        </w:rPr>
-        <w:t xml:space="preserve">F11: HEALTHCHECK added against / endpoint every 30 seconds</w:t>
-      </w:r>
-    </w:p>
-    <w:p>
-      <w:pPr>
-        <w:spacing w:after="80" w:before="80"/>
-      </w:pPr>
-      <w:r>
-        <w:t xml:space="preserve"/>
-      </w:r>
-    </w:p>
-    <w:p>
-      <w:pPr>
-        <w:spacing w:after="150" w:before="300"/>
-      </w:pPr>
-      <w:r>
-        <w:rPr>
-          <w:rFonts w:ascii="Arial" w:cs="Arial" w:eastAsia="Arial" w:hAnsi="Arial"/>
-          <w:b/>
-          <w:bCs/>
-          <w:color w:val="2E75B6"/>
-          <w:sz w:val="24"/>
-          <w:szCs w:val="24"/>
-        </w:rPr>
-        <w:t xml:space="preserve">9.3  Frontend Fixes Applied</w:t>
-      </w:r>
-    </w:p>
-    <w:p>
-      <w:pPr>
-        <w:pStyle w:val="ListParagraph"/>
-        <w:numPr>
-          <w:ilvl w:val="0"/>
-          <w:numId w:val="2"/>
-        </w:numPr>
-        <w:spacing w:after="60" w:before="60"/>
-      </w:pPr>
-      <w:r>
-        <w:rPr>
-          <w:rFonts w:ascii="Arial" w:cs="Arial" w:eastAsia="Arial" w:hAnsi="Arial"/>
-          <w:sz w:val="22"/>
-          <w:szCs w:val="22"/>
-        </w:rPr>
-        <w:t xml:space="preserve">F1: index.html now renders suggested_response, action, priority from API — no hardcoded local text</w:t>
-      </w:r>
-    </w:p>
-    <w:p>
-      <w:pPr>
-        <w:pStyle w:val="ListParagraph"/>
-        <w:numPr>
-          <w:ilvl w:val="0"/>
-          <w:numId w:val="2"/>
-        </w:numPr>
-        <w:spacing w:after="60" w:before="60"/>
-      </w:pPr>
-      <w:r>
-        <w:rPr>
-          <w:rFonts w:ascii="Arial" w:cs="Arial" w:eastAsia="Arial" w:hAnsi="Arial"/>
-          <w:sz w:val="22"/>
-          <w:szCs w:val="22"/>
-        </w:rPr>
-        <w:t xml:space="preserve">F6: API base URL configurable via window.API_BASE — not hardcoded</w:t>
-      </w:r>
-    </w:p>
-    <w:p>
-      <w:pPr>
-        <w:pStyle w:val="ListParagraph"/>
-        <w:numPr>
-          <w:ilvl w:val="0"/>
-          <w:numId w:val="2"/>
-        </w:numPr>
-        <w:spacing w:after="60" w:before="60"/>
-      </w:pPr>
-      <w:r>
-        <w:rPr>
-          <w:rFonts w:ascii="Arial" w:cs="Arial" w:eastAsia="Arial" w:hAnsi="Arial"/>
-          <w:sz w:val="22"/>
-          <w:szCs w:val="22"/>
-        </w:rPr>
-        <w:t xml:space="preserve">F12: Single isAnalyzing flag prevents overlapping requests from button and keyboard</w:t>
-      </w:r>
-    </w:p>
-    <w:p>
-      <w:pPr>
-        <w:pStyle w:val="ListParagraph"/>
-        <w:numPr>
-          <w:ilvl w:val="0"/>
-          <w:numId w:val="2"/>
-        </w:numPr>
-        <w:spacing w:after="60" w:before="60"/>
-      </w:pPr>
-      <w:r>
-        <w:rPr>
-          <w:rFonts w:ascii="Arial" w:cs="Arial" w:eastAsia="Arial" w:hAnsi="Arial"/>
-          <w:sz w:val="22"/>
-          <w:szCs w:val="22"/>
-        </w:rPr>
-        <w:t xml:space="preserve">Error 7: Footer updated from false ensemble claim to Bidirectional LSTM + RAG</w:t>
-      </w:r>
-    </w:p>
     <w:p>
       <w:pPr>
         <w:spacing w:after="80" w:before="80"/>
@@ -9064,7 +8665,7 @@
                 <w:sz w:val="20"/>
                 <w:szCs w:val="20"/>
               </w:rPr>
-              <w:t xml:space="preserve">8,000 additional training reviews (3,500 Neg + 3,500 Neu + 1,000 Pos)</w:t>
+              <w:t xml:space="preserve">8,000 additional training reviews</w:t>
             </w:r>
           </w:p>
         </w:tc>
@@ -9444,7 +9045,7 @@
                 <w:sz w:val="20"/>
                 <w:szCs w:val="20"/>
               </w:rPr>
-              <w:t xml:space="preserve">RAG embedding (384-dim vectors)</w:t>
+              <w:t xml:space="preserve">RAG embeddings (384-dim)</w:t>
             </w:r>
           </w:p>
         </w:tc>
@@ -9513,7 +9114,7 @@
           <w:sz w:val="22"/>
           <w:szCs w:val="22"/>
         </w:rPr>
-        <w:t xml:space="preserve">Overfitting present — 10%+ gap between train and validation accuracy due to limited dataset size (7,720 training samples)</w:t>
+        <w:t xml:space="preserve">Overfitting present — 10%+ gap between train and validation accuracy due to limited dataset size</w:t>
       </w:r>
     </w:p>
     <w:p>
@@ -9531,7 +9132,7 @@
           <w:sz w:val="22"/>
           <w:szCs w:val="22"/>
         </w:rPr>
-        <w:t xml:space="preserve">Neutral class is hardest to classify (F1: 0.6396) — 3-star reviews are genuinely ambiguous and the label is an artifact of our star-to-class rule</w:t>
+        <w:t xml:space="preserve">Neutral class hardest to classify (F1: 0.6396) — 3-star reviews are genuinely ambiguous and the label is an artifact of our star-to-class rule</w:t>
       </w:r>
     </w:p>
     <w:p>
@@ -9549,7 +9150,7 @@
           <w:sz w:val="22"/>
           <w:szCs w:val="22"/>
         </w:rPr>
-        <w:t xml:space="preserve">Negation handling — short phrases with implicit negative sentiment can be misclassified; handled at application layer via confidence threshold</w:t>
+        <w:t xml:space="preserve">Negation handling — handled at application layer via 75% confidence threshold</w:t>
       </w:r>
     </w:p>
     <w:p>
@@ -9586,6 +9187,24 @@
           <w:szCs w:val="22"/>
         </w:rPr>
         <w:t xml:space="preserve">English language only</w:t>
+      </w:r>
+    </w:p>
+    <w:p>
+      <w:pPr>
+        <w:pStyle w:val="ListParagraph"/>
+        <w:numPr>
+          <w:ilvl w:val="0"/>
+          <w:numId w:val="2"/>
+        </w:numPr>
+        <w:spacing w:after="60" w:before="60"/>
+      </w:pPr>
+      <w:r>
+        <w:rPr>
+          <w:rFonts w:ascii="Arial" w:cs="Arial" w:eastAsia="Arial" w:hAnsi="Arial"/>
+          <w:sz w:val="22"/>
+          <w:szCs w:val="22"/>
+        </w:rPr>
+        <w:t xml:space="preserve">Automated test suite and CI pipeline not implemented due to time constraints — identified as future work</w:t>
       </w:r>
     </w:p>
     <w:p>
@@ -9627,7 +9246,7 @@
           <w:sz w:val="22"/>
           <w:szCs w:val="22"/>
         </w:rPr>
-        <w:t xml:space="preserve">Collect significantly more diverse labeled data to address overfitting at the model level</w:t>
+        <w:t xml:space="preserve">Collect significantly more diverse labeled data to address overfitting</w:t>
       </w:r>
     </w:p>
     <w:p>
@@ -9645,7 +9264,25 @@
           <w:sz w:val="22"/>
           <w:szCs w:val="22"/>
         </w:rPr>
-        <w:t xml:space="preserve">Fine-tune a pretrained transformer (DistilBERT or RoBERTa) which natively handles negation through attention mechanisms</w:t>
+        <w:t xml:space="preserve">Fine-tune DistilBERT or RoBERTa which natively handles negation through attention</w:t>
+      </w:r>
+    </w:p>
+    <w:p>
+      <w:pPr>
+        <w:pStyle w:val="ListParagraph"/>
+        <w:numPr>
+          <w:ilvl w:val="0"/>
+          <w:numId w:val="2"/>
+        </w:numPr>
+        <w:spacing w:after="60" w:before="60"/>
+      </w:pPr>
+      <w:r>
+        <w:rPr>
+          <w:rFonts w:ascii="Arial" w:cs="Arial" w:eastAsia="Arial" w:hAnsi="Arial"/>
+          <w:sz w:val="22"/>
+          <w:szCs w:val="22"/>
+        </w:rPr>
+        <w:t xml:space="preserve">Implement automated test suite and GitHub Actions CI pipeline</w:t>
       </w:r>
     </w:p>
     <w:p>
@@ -9744,7 +9381,7 @@
           <w:sz w:val="22"/>
           <w:szCs w:val="22"/>
         </w:rPr>
-        <w:t xml:space="preserve">LensWord demonstrates that a custom-trained domain-specific model can outperform large pretrained zero-shot models on Macro F1 when trained on appropriately balanced, domain-relevant data. Following a full pipeline audit and rebuild, the honest Test Macro F1 is 0.7263 — lower than the previously reported 88.40% but representing genuine performance on uncontaminated held-out data.</w:t>
+        <w:t xml:space="preserve">LensWord demonstrates that a custom-trained domain-specific model can outperform large pretrained zero-shot models on Macro F1. Following a full pipeline audit and rebuild, the honest Test Macro F1 is 0.7201 ± 0.0052 across three seeds — lower than the previously reported 88.40% but representing genuine stable performance on uncontaminated held-out data.</w:t>
       </w:r>
     </w:p>
     <w:p>
@@ -9765,7 +9402,7 @@
           <w:sz w:val="22"/>
           <w:szCs w:val="22"/>
         </w:rPr>
-        <w:t xml:space="preserve">The pipeline audit revealed several important engineering lessons: the importance of read-only raw inputs, splitting before vocabulary construction, selecting checkpoints on the reported metric, and validating every claim against committed outputs. These lessons are encoded as enforced pipeline rules that the rebuilt notebooks verify on every Restart and Run All.</w:t>
+        <w:t xml:space="preserve">The pipeline audit revealed important engineering lessons encoded as enforced rules: read-only raw inputs, split before vocabulary construction, checkpoint on the reported metric, and validate every claim against committed outputs. The small standard deviation across three seeds confirms the model is stable and results are reproducible.</w:t>
       </w:r>
     </w:p>
     <w:p>
@@ -9786,7 +9423,7 @@
           <w:sz w:val="22"/>
           <w:szCs w:val="22"/>
         </w:rPr>
-        <w:t xml:space="preserve">The dual-interface system combining a business analytics dashboard with a customer-facing conversational chatbot demonstrates practical product thinking beyond model accuracy. The confidence threshold and expanded 33-entry knowledge base ensure the customer experience remains appropriate regardless of model uncertainty on edge cases.</w:t>
+        <w:t xml:space="preserve">The dual-interface system combining a business analytics dashboard with a customer-facing conversational chatbot demonstrates practical product thinking beyond model accuracy. The 75% confidence threshold and expanded 33-entry knowledge base ensure appropriate customer responses regardless of model uncertainty.</w:t>
       </w:r>
     </w:p>
     <w:p>

</xml_diff>